<commit_message>
Sửa bài báo theo phản biện: điểm thay đổi, Hình 1, NĐ 267/2025, chỉ số
- Đổi tên bài: Quản lý quyền sở hữu trí tuệ trong trường đại học trước yêu cầu mới
  của chính sách.
- Bảng 1 thêm tính chất (có điều kiện pháp lý), điểm thay đổi và hệ quả quản lý;
  mỗi dòng một tính chất; phân biệt mới, sửa đổi, kế thừa theo văn bản gốc.
- Hình 1: luồng chính nộp đơn trước công bố, không chờ nghiệm thu; nghiệm thu là
  điểm kiểm tra; bảo mật từ khi khai báo; nguồn chi từ quỹ; thời hạn sau bộc lộ ghi
  kèm điều kiện.
- Bổ sung Nghị định số 267/2025/NĐ-CP, 13 tài liệu; mô tả lại phương pháp; Bảng 2
  định nghĩa tử số, mẫu số; Bàn luận về các lựa chọn có đánh đổi.
- Thêm bảng trích xuất làm tài liệu kiểm chứng.

Co-Authored-By: Claude Opus 5.5 <noreply@anthropic.com>
Claude-Session: https://claude.ai/code/session_01ThGArqDrUUsqC1zG1BQvVL
</commit_message>
<xml_diff>
--- a/Ban_cuoi/Bai_bao_Quan_ly_SHTT_yeu_cau_chinh_sach_moi.docx
+++ b/Ban_cuoi/Bai_bao_Quan_ly_SHTT_yeu_cau_chinh_sach_moi.docx
@@ -14,7 +14,7 @@
           <w:i w:val="0"/>
           <w:sz w:val="28"/>
         </w:rPr>
-        <w:t>QUẢN LÝ SỞ HỮU TRÍ TUỆ TẠI TRƯỜNG ĐẠI HỌC TRƯỚC YÊU CẦU CHÍNH SÁCH MỚI</w:t>
+        <w:t>QUẢN LÝ QUYỀN SỞ HỮU TRÍ TUỆ TRONG TRƯỜNG ĐẠI HỌC TRƯỚC YÊU CẦU MỚI CỦA CHÍNH SÁCH</w:t>
       </w:r>
     </w:p>
     <w:p>
@@ -63,7 +63,7 @@
           <w:b w:val="0"/>
           <w:i w:val="0"/>
         </w:rPr>
-        <w:t xml:space="preserve"> Bài báo phân tích các yêu cầu từ chính sách mới đối với quản lý sở hữu trí tuệ trong trường đại học và chuyển các yêu cầu đó thành hệ thống giải pháp cùng điều kiện tổ chức thực hiện. Nghiên cứu sử dụng thiết kế định tính, phân tích tài liệu và đối chiếu chính sách trên mười hai tài liệu công khai, gồm sáu văn bản của Việt Nam cập nhật đến tháng 9 năm 2026, hai hướng dẫn quốc tế và bốn công trình nghiên cứu. Các yêu cầu được trích xuất theo căn cứ, chủ thể, phạm vi áp dụng và đối chiếu với năm cấu phần quản lý: quy chế, tổ chức, quy trình, tài chính và lợi ích, đào tạo và văn hóa. Kết quả xác định năm nhóm yêu cầu, gồm định hướng chính sách, nghĩa vụ pháp lý và quyền được trao; mỗi nhóm đòi hỏi thay đổi đồng thời ở nhiều cấu phần. Bài báo đề xuất năm nhóm giải pháp, một quy trình phối hợp có khai báo, sàng lọc và xem xét bảo mật trước công bố, cùng bộ chỉ số phân biệt hoạt động, đầu ra và kết quả khai thác. Đóng góp của bài báo là cách liên kết yêu cầu chính sách với nhiệm vụ, trách nhiệm và chỉ số ở cấp trường; hệ thống giải pháp cần được tham vấn chuyên gia hoặc thí điểm trước khi áp dụng rộng.</w:t>
+        <w:t xml:space="preserve"> Bài báo xác định những thay đổi trong yêu cầu chính sách đối với quản lý quyền sở hữu trí tuệ trong trường đại học và chuyển các thay đổi đó thành cơ chế thực hiện ở cấp trường. Nghiên cứu sử dụng thiết kế định tính, phân tích tài liệu và đối chiếu chính sách trên mười ba tài liệu công khai được chọn có chủ đích, gồm bảy văn bản của Việt Nam cập nhật đến tháng 9 năm 2026, hai hướng dẫn quốc tế và bốn công trình nghiên cứu. Mỗi yêu cầu được phân loại theo tính chất, gồm định hướng, nghĩa vụ, quyền, điều kiện pháp lý, và theo mức độ thay đổi. Kết quả cho thấy thay đổi thực chất tập trung ở quyền đối với kết quả nghiên cứu, cơ chế lợi ích của tác giả và quyền tổ chức khai thác; đăng ký bảo hộ đồng thời với công bố là yêu cầu kế thừa, nay có thêm công cụ pháp lý để thực hiện. Bài báo đề xuất năm nhóm giải pháp, một quy trình cho phép quyết định và cấp kinh phí nộp đơn trước công bố mà không chờ nghiệm thu, cùng bộ chỉ số có định nghĩa. Đóng góp của bài báo là cách phân biệt yêu cầu mới với yêu cầu kế thừa và gắn mỗi thay đổi với quyết định quản lý cụ thể; hệ thống giải pháp cần được kiểm chứng trước khi áp dụng.</w:t>
       </w:r>
     </w:p>
     <w:p>
@@ -84,7 +84,7 @@
           <w:b w:val="0"/>
           <w:i w:val="0"/>
         </w:rPr>
-        <w:t xml:space="preserve"> Chính sách sở hữu trí tuệ; Quản lý sở hữu trí tuệ; Tài sản trí tuệ; Trường đại học</w:t>
+        <w:t xml:space="preserve"> Chính sách sở hữu trí tuệ; Quản lý quyền sở hữu trí tuệ; Tài sản trí tuệ; Trường đại học</w:t>
       </w:r>
     </w:p>
     <w:p>
@@ -99,7 +99,7 @@
           <w:i w:val="0"/>
           <w:sz w:val="24"/>
         </w:rPr>
-        <w:t>INTELLECTUAL PROPERTY MANAGEMENT IN UNIVERSITIES IN RESPONSE TO NEW POLICY REQUIREMENTS</w:t>
+        <w:t>INTELLECTUAL PROPERTY RIGHTS MANAGEMENT IN UNIVERSITIES IN RESPONSE TO NEW POLICY REQUIREMENTS</w:t>
       </w:r>
     </w:p>
     <w:p>
@@ -127,7 +127,7 @@
           <w:b w:val="0"/>
           <w:i/>
         </w:rPr>
-        <w:t>This article analyses the requirements that new policies place on intellectual property management in universities and translates them into a set of management measures and implementation conditions. The study adopts a qualitative design based on document analysis and policy comparison of twelve publicly available documents: six Vietnamese policy directives, strategies and laws issued or amended up to September 2026, two international guidance documents and four research works. Requirements were extracted by legal basis, responsible actor, scope of application and content to be specified, and then mapped onto five management components: regulations, organisation, procedures, finance and benefit sharing, and training and intellectual property culture. The analysis identifies five groups of requirements, combining policy orientations, legal obligations and rights granted to universities; each group calls for simultaneous changes in several components. The article proposes five groups of measures, a coordination procedure with disclosure, screening and confidentiality review before publication, and an indicator set that distinguishes activities, outputs and exploitation outcomes. Its contribution lies in linking each policy requirement to tasks, responsibilities and monitoring indicators at institutional level. The proposed system has not yet been validated in practice and should be tested through expert consultation or pilot implementation before wider adoption.</w:t>
+        <w:t>This article identifies how new policies have changed the requirements for intellectual property rights management in universities and translates those changes into implementation mechanisms at institutional level. The study adopts a qualitative design based on document analysis and policy comparison of thirteen purposively selected public documents: seven Vietnamese policy and legal documents current to September 2026, two international guidance documents and four research works. Each requirement was classified by its nature, as a policy orientation, legal obligation, right or legal condition, and by its degree of change from earlier rules. Substantive changes are concentrated in rights over research results, inventor benefit mechanisms and the right to organise commercialisation; filing for protection at the time of publication and using intellectual property indicators in evaluation are inherited requirements that now have stronger legal tools. The article proposes five groups of measures, a procedure that allows filing decisions and fees to be approved before publication without waiting for project acceptance, and indicators defined by numerator, denominator and data source. Its contribution lies in distinguishing new from inherited requirements and linking each change to a specific management decision. The proposed system has not yet been validated and should be tested through expert consultation or pilot implementation before wider adoption.</w:t>
       </w:r>
     </w:p>
     <w:p>
@@ -155,7 +155,7 @@
           <w:b w:val="0"/>
           <w:i/>
         </w:rPr>
-        <w:t>Intellectual property policy; Intellectual property management; Intellectual assets; Universities</w:t>
+        <w:t>Intellectual property policy; Intellectual property rights management; Intellectual assets; Universities</w:t>
       </w:r>
     </w:p>
     <w:p>
@@ -196,7 +196,7 @@
           <w:b w:val="0"/>
           <w:i w:val="0"/>
         </w:rPr>
-        <w:t>Trường đại học vừa tạo ra tri thức mới qua nghiên cứu và đào tạo, vừa là nơi hình thành nhiều loại tài sản trí tuệ như sáng chế, kiểu dáng công nghiệp, phần mềm, giáo trình, cơ sở dữ liệu và bí quyết. Giá trị của chúng chỉ được hiện thực hóa khi được nhận diện kịp thời, bảo hộ bằng công cụ phù hợp và khai thác (Siegel et al., 2007).</w:t>
+        <w:t>Trường đại học vừa tạo ra tri thức mới qua nghiên cứu và đào tạo, vừa là nơi hình thành nhiều loại tài sản trí tuệ như sáng chế, kiểu dáng công nghiệp, phần mềm, giáo trình, cơ sở dữ liệu và bí quyết. Một phần giá trị của các tài sản này phụ thuộc vào việc nhận diện kịp thời, lựa chọn công cụ bảo hộ phù hợp và khai thác (Siegel et al., 2007); phần khác hình thành qua công bố, chia sẻ và ứng dụng tri thức.</w:t>
       </w:r>
     </w:p>
     <w:p>
@@ -210,7 +210,7 @@
           <w:b w:val="0"/>
           <w:i w:val="0"/>
         </w:rPr>
-        <w:t>Giai đoạn 2025 - 2026, hoạt động này chịu tác động trực tiếp của nhiều văn bản mới. Kết luận số 51-KL/TW yêu cầu chuyển từ tư duy quản lý hành chính sang kiến tạo hệ sinh thái sở hữu trí tuệ (Bộ Chính trị, 2026). Chiến lược sở hữu trí tuệ đến năm 2030 được sửa đổi, yêu cầu dùng chỉ số sở hữu trí tuệ để đánh giá cơ sở giáo dục đại học (Thủ tướng Chính phủ, 2026). Luật Khoa học, công nghệ và đổi mới sáng tạo, Luật Giáo dục đại học và Luật Sở hữu trí tuệ sửa đổi thay đổi quyền đối với kết quả nghiên cứu, quyền đăng ký và cơ chế lợi ích của tác giả (Quốc hội, 2025a, 2025b; Văn phòng Quốc hội, 2026).</w:t>
+        <w:t>Giai đoạn 2025 - 2026, hoạt động này chịu tác động của nhiều văn bản. Kết luận số 51-KL/TW yêu cầu chuyển từ tư duy quản lý hành chính sang kiến tạo hệ sinh thái sở hữu trí tuệ (Bộ Chính trị, 2026). Chiến lược sở hữu trí tuệ đến năm 2030 được sửa đổi (Thủ tướng Chính phủ, 2026). Luật Khoa học, công nghệ và đổi mới sáng tạo cùng nghị định quy định chi tiết, Luật Giáo dục đại học và Luật Sở hữu trí tuệ sửa đổi điều chỉnh quyền đối với kết quả nghiên cứu, quyền đăng ký và lợi ích của tác giả (Chính phủ, 2025; Quốc hội, 2025a, 2025b; Văn phòng Quốc hội, 2026).</w:t>
       </w:r>
     </w:p>
     <w:p>
@@ -224,7 +224,7 @@
           <w:b w:val="0"/>
           <w:i w:val="0"/>
         </w:rPr>
-        <w:t>Các văn bản này có văn bản nêu định hướng, có văn bản đặt nghĩa vụ, có văn bản trao quyền. Vấn đề đặt ra là cụ thể hóa chúng thành nội dung quản lý và cơ chế tổ chức thực hiện ở cấp trường. Bài báo trả lời ba câu hỏi: những yêu cầu chính sách nào cần được cụ thể hóa; các yêu cầu đó cần được chuyển thành nội dung quản lý, giải pháp và cơ chế phối hợp nào; và cần những điều kiện, chỉ số theo dõi nào để triển khai. Phạm vi phân tích là tài liệu công khai; bài báo không đánh giá thực trạng của một trường cụ thể.</w:t>
+        <w:t>Không phải mọi nội dung trong các văn bản này đều mới: có nội dung thay đổi thực chất, có nội dung được kế thừa và nhắc lại. Nếu không phân biệt, trường đại học dễ dàn trải nguồn lực hoặc bỏ sót thay đổi buộc phải điều chỉnh. Bài báo trả lời ba câu hỏi: yêu cầu nào thực sự thay đổi và buộc trường điều chỉnh quyết định, quy trình hay cách phân chia lợi ích nào; các thay đổi đó cần được chuyển thành giải pháp và cơ chế phối hợp nào; và cần điều kiện, chỉ số nào để theo dõi. Phạm vi phân tích là tài liệu công khai; bài báo không đánh giá thực trạng của một trường cụ thể.</w:t>
       </w:r>
     </w:p>
     <w:p>
@@ -338,7 +338,7 @@
           <w:b w:val="0"/>
           <w:i w:val="0"/>
         </w:rPr>
-        <w:t xml:space="preserve"> Siegel và cộng sự (2007) cho rằng cần có tỷ lệ chia hợp lý cho nhà sáng chế và cần điều chỉnh hệ thống đánh giá, đãi ngộ để hoạt động thương mại hóa được ghi nhận; đồng thời nhân sự chuyển giao cần kỹ năng thương mại chứ không chỉ kỹ năng pháp lý. Khuyến nghị (EU) 2022/2415 đề nghị hệ thống khuyến khích công bằng, phát triển kỹ năng cho mọi chủ thể và thống nhất định nghĩa, chỉ số đo lường. Nguyễn (2025) nêu yêu cầu đào tạo và nâng cao nhận thức cho giảng viên, người học. Các nghiên cứu quốc tế dựa trên pháp luật khác Việt Nam, nên mô hình khuyến khích không thể chuyển nguyên trạng.</w:t>
+        <w:t xml:space="preserve"> Siegel và cộng sự (2007) cho rằng cần có tỷ lệ chia hợp lý cho nhà sáng chế và cần điều chỉnh hệ thống đánh giá, đãi ngộ để hoạt động thương mại hóa được ghi nhận; đồng thời nhân sự chuyển giao cần kỹ năng thương mại chứ không chỉ kỹ năng pháp lý. Khuyến nghị (EU) 2022/2415 đề nghị hệ thống khuyến khích công bằng, phát triển kỹ năng cho mọi chủ thể và thống nhất định nghĩa, chỉ số đo lường. Nguyễn (2025) nêu yêu cầu đào tạo và nâng cao nhận thức cho giảng viên, người học. Hai nghiên cứu quốc tế được lựa chọn dựa trên pháp luật khác Việt Nam, nên mô hình khuyến khích không thể chuyển nguyên trạng.</w:t>
       </w:r>
     </w:p>
     <w:p>
@@ -367,7 +367,7 @@
           <w:b w:val="0"/>
           <w:i w:val="0"/>
         </w:rPr>
-        <w:t>Từ các tài liệu đã đọc, có thể thấy nghiên cứu quốc tế cung cấp nhiều bằng chứng về từng cấu phần quản lý, còn nghiên cứu trong nước đã bàn về quyền của các chủ thể và ứng dụng công nghệ. Phần bài báo có thể bổ sung là sự liên kết giữa các yêu cầu chính sách ban hành giai đoạn 2025 - 2026 với các cấu phần quản lý ở cấp trường, theo đó mỗi yêu cầu được gắn với chủ thể, nội dung cần cụ thể hóa, điều kiện và chỉ số theo dõi.</w:t>
+        <w:t>Trong các công trình được lựa chọn, nghiên cứu quốc tế cung cấp bằng chứng về từng cấu phần quản lý, còn nghiên cứu trong nước bàn về quyền của các chủ thể và yêu cầu phối hợp. Các công trình trong nước công bố năm 2025 chưa phân tích nghị định quy định chi tiết Luật Khoa học, công nghệ và đổi mới sáng tạo và các văn bản sửa đổi năm 2026. Phần bài báo có thể bổ sung là việc phân biệt yêu cầu mới với yêu cầu kế thừa và gắn mỗi thay đổi với quyết định quản lý, chủ thể và chỉ số theo dõi ở cấp trường.</w:t>
       </w:r>
     </w:p>
     <w:p>
@@ -381,7 +381,7 @@
           <w:b w:val="0"/>
           <w:i w:val="0"/>
         </w:rPr>
-        <w:t>Bài báo sử dụng khung phân tích năm cấu phần: quy chế; tổ chức; quy trình; tài chính và lợi ích; đào tạo và văn hóa sở hữu trí tuệ. Năm cấu phần này tương ứng với các nhóm vấn đề trong tổng quan và các nhóm nguyên tắc của Khuyến nghị (EU) 2022/2415.</w:t>
+        <w:t>Bài báo sử dụng khung phân tích năm cấu phần: quy chế; tổ chức; quy trình; tài chính và lợi ích; đào tạo và văn hóa sở hữu trí tuệ. Khung này được xác định trước khi trích xuất, kế thừa từ đề tài cấp cơ sở của nhóm tác giả và đối chiếu với các nhóm nguyên tắc của Khuyến nghị (EU) 2022/2415.</w:t>
       </w:r>
     </w:p>
     <w:p>
@@ -410,7 +410,7 @@
           <w:b w:val="0"/>
           <w:i w:val="0"/>
         </w:rPr>
-        <w:t>Nghiên cứu sử dụng thiết kế định tính, kết hợp phân tích tài liệu và đối chiếu chính sách. Tập tài liệu gồm ba loại: văn bản chính sách, pháp luật của Việt Nam; văn bản hướng dẫn quốc tế về quản lý tài sản trí tuệ; và nghiên cứu học thuật về quản lý sở hữu trí tuệ trong trường đại học.</w:t>
+        <w:t>Nghiên cứu sử dụng thiết kế định tính, kết hợp phân tích tài liệu và đối chiếu chính sách. Tài liệu được chọn có chủ đích, không qua tìm kiếm hệ thống trên cơ sở dữ liệu thư mục. Văn bản của Việt Nam được chọn từ tập văn bản nhóm tác giả thu thập khi thực hiện đề tài cấp cơ sở, theo hai tiêu chí: được ban hành hoặc sửa đổi từ năm 2025 đến ngày chốt 30 tháng 9 năm 2026; có quy định trực tiếp về quyền đối với kết quả nghiên cứu, bảo hộ, khai thác, phân chia lợi ích hoặc đào tạo sở hữu trí tuệ trong cơ sở giáo dục đại học. Bảy văn bản đáp ứng tiêu chí là Kết luận số 51-KL/TW, Quyết định số 1624/QĐ-TTg, Luật số 93/2025/QH15, Nghị định số 267/2025/NĐ-CP, Luật số 125/2025/QH15, Văn bản hợp nhất số 67/VBHN-VPQH của Luật Sở hữu trí tuệ và Quyết định số 1068/QĐ-TTg; quyết định sau được đưa vào để so sánh nội dung Chiến lược trước và sau sửa đổi.</w:t>
       </w:r>
     </w:p>
     <w:p>
@@ -424,7 +424,7 @@
           <w:b w:val="0"/>
           <w:i w:val="0"/>
         </w:rPr>
-        <w:t>Tài liệu được chọn khi liên quan trực tiếp đến quản lý sở hữu trí tuệ trong trường đại học và xác định được nguồn, thời điểm, phạm vi áp dụng. Tập phân tích gồm mười hai tài liệu: sáu văn bản của Việt Nam, gồm Kết luận số 51-KL/TW, Quyết định số 1068/QĐ-TTg và Quyết định số 1624/QĐ-TTg sửa đổi, bổ sung quyết định này, Luật số 93/2025/QH15, Luật số 125/2025/QH15 và Văn bản hợp nhất số 67/VBHN-VPQH của Luật Sở hữu trí tuệ; hai văn bản quốc tế là Khuyến nghị (EU) 2022/2415 và hướng dẫn tra cứu sáng chế thuộc phạm vi công cộng của Tổ chức Sở hữu trí tuệ thế giới; bốn công trình nghiên cứu được trình bày tại Mục 2. Văn bản của Việt Nam tập trung vào giai đoạn 2025 - 2026; Quyết định số 1068/QĐ-TTg được dùng để xác định nội dung còn hiệu lực của Chiến lược. Ngày chốt cập nhật văn bản là 30 tháng 9 năm 2026.</w:t>
+        <w:t>Hai hướng dẫn quốc tế và bốn công trình nghiên cứu được chọn từ thư viện tài liệu của đề tài theo hai tiêu chí: có toàn văn và bàn trực tiếp về ít nhất một cấu phần quản lý. Bốn công trình gồm hai nghiên cứu quốc tế về văn phòng chuyển giao và hợp tác đại học với doanh nghiệp, hai nghiên cứu trong nước công bố năm 2025. Do số lượng ít và cách chọn không hệ thống, nhận xét về nghiên cứu chỉ giới hạn trong các công trình được lựa chọn.</w:t>
       </w:r>
     </w:p>
     <w:p>
@@ -438,21 +438,7 @@
           <w:b w:val="0"/>
           <w:i w:val="0"/>
         </w:rPr>
-        <w:t>Mỗi văn bản được đọc toàn văn và trích xuất vào bảng gồm năm trường: căn cứ; yêu cầu; chủ thể và phạm vi áp dụng; nội dung quản lý cần cụ thể hóa; điều kiện thực hiện và chỉ số có thể theo dõi. Mỗi yêu cầu được phân loại thành định hướng chính sách, nghĩa vụ pháp lý hoặc quyền được trao cho trường đại học. Phần đề xuất của nhóm tác giả được trình bày tách biệt với nội dung của văn bản.</w:t>
-      </w:r>
-    </w:p>
-    <w:p>
-      <w:pPr>
-        <w:spacing w:before="0" w:after="60"/>
-        <w:ind w:firstLine="340"/>
-        <w:jc w:val="both"/>
-      </w:pPr>
-      <w:r>
-        <w:rPr>
-          <w:b w:val="0"/>
-          <w:i w:val="0"/>
-        </w:rPr>
-        <w:t>Các yêu cầu sau đó được đối chiếu với năm cấu phần quản lý để xác định mỗi yêu cầu đòi hỏi thay đổi ở cấu phần nào. Hệ thống giải pháp được phát triển từ một đề tài cấp cơ sở của nhóm tác giả; bài báo chỉ kế thừa phần lập luận dựa trên tài liệu công khai, không sử dụng số liệu nội bộ. Nghiên cứu không thực hiện khảo sát hay phỏng vấn, nên kết quả là đề xuất có căn cứ văn bản, chưa phải mô hình đã được kiểm chứng.</w:t>
+        <w:t>Mỗi văn bản được đọc toàn văn và trích xuất vào bảng gồm các trường: căn cứ; yêu cầu; chủ thể và phạm vi; tính chất; mức độ thay đổi; hệ quả quản lý. Tính chất gồm định hướng chính sách, nghĩa vụ pháp lý, quyền được trao và điều kiện pháp lý, tức điều kiện để được hưởng bảo hộ; mỗi dòng chỉ chứa yêu cầu cùng tính chất. Mức độ thay đổi gồm mới, sửa đổi và kế thừa, được xác định bằng cách so sánh văn bản sửa đổi với văn bản gốc và với chú thích về văn bản sửa đổi trong văn bản hợp nhất; với luật, nghị định thay thế văn bản cũ không có trong tập phân tích, bài báo chỉ ghi là quy định của văn bản mới kèm thời điểm hiệu lực, không suy ra mức độ thay đổi. Các yêu cầu sau đó được đối chiếu với năm cấu phần để xác định quyết định quản lý cần điều chỉnh. Việc trích xuất có sử dụng công cụ hỗ trợ như kê khai tại tờ khai kèm bản thảo; mỗi điều khoản được nhóm tác giả đối chiếu lại với toàn văn. Bảng trích xuất được lưu làm tài liệu kiểm chứng. Nghiên cứu chưa thực hiện mã hóa độc lập bởi hai người và không khảo sát hay phỏng vấn, nên kết quả là đề xuất có căn cứ văn bản, chưa phải mô hình đã được kiểm chứng.</w:t>
       </w:r>
     </w:p>
     <w:p>
@@ -482,7 +468,7 @@
           <w:b/>
           <w:i w:val="0"/>
         </w:rPr>
-        <w:t>4.1. Các yêu cầu chính sách đối với quản lý sở hữu trí tuệ trong trường đại học</w:t>
+        <w:t>4.1. Điểm thay đổi trong yêu cầu chính sách và hệ quả quản lý</w:t>
       </w:r>
     </w:p>
     <w:p>
@@ -496,7 +482,7 @@
           <w:b w:val="0"/>
           <w:i w:val="0"/>
         </w:rPr>
-        <w:t>Kết quả trích xuất cho thấy các yêu cầu chính sách hội tụ thành năm nhóm, được tổng hợp tại Bảng 1.</w:t>
+        <w:t>Bảng 1 tổng hợp các yêu cầu liên quan trực tiếp đến năm nhóm giải pháp, kèm tính chất, điểm thay đổi và hệ quả quản lý.</w:t>
       </w:r>
     </w:p>
     <w:p>
@@ -523,7 +509,7 @@
           <w:b/>
           <w:i w:val="0"/>
         </w:rPr>
-        <w:t>Bảng 1. Yêu cầu chính sách và nội dung quản lý cần cụ thể hóa trong trường đại học</w:t>
+        <w:t>Bảng 1. Yêu cầu chính sách, điểm thay đổi và hệ quả quản lý đối với trường đại học</w:t>
       </w:r>
     </w:p>
     <w:tbl>
@@ -534,10 +520,11 @@
         <w:tblLook w:firstColumn="1" w:firstRow="1" w:lastColumn="0" w:lastRow="0" w:noHBand="0" w:noVBand="1" w:val="04A0"/>
       </w:tblPr>
       <w:tblGrid>
-        <w:gridCol w:w="2409"/>
-        <w:gridCol w:w="2409"/>
-        <w:gridCol w:w="2409"/>
-        <w:gridCol w:w="2409"/>
+        <w:gridCol w:w="1928"/>
+        <w:gridCol w:w="1928"/>
+        <w:gridCol w:w="1928"/>
+        <w:gridCol w:w="1928"/>
+        <w:gridCol w:w="1928"/>
       </w:tblGrid>
       <w:tr>
         <w:trPr>
@@ -546,7 +533,7 @@
         </w:trPr>
         <w:tc>
           <w:tcPr>
-            <w:tcW w:type="dxa" w:w="2381"/>
+            <w:tcW w:type="dxa" w:w="1951"/>
             <w:shd w:val="clear" w:color="auto" w:fill="DCE8F7"/>
           </w:tcPr>
           <w:p>
@@ -568,7 +555,7 @@
         </w:tc>
         <w:tc>
           <w:tcPr>
-            <w:tcW w:type="dxa" w:w="2835"/>
+            <w:tcW w:type="dxa" w:w="2639"/>
             <w:shd w:val="clear" w:color="auto" w:fill="DCE8F7"/>
           </w:tcPr>
           <w:p>
@@ -590,7 +577,7 @@
         </w:tc>
         <w:tc>
           <w:tcPr>
-            <w:tcW w:type="dxa" w:w="2154"/>
+            <w:tcW w:type="dxa" w:w="1090"/>
             <w:shd w:val="clear" w:color="auto" w:fill="DCE8F7"/>
           </w:tcPr>
           <w:p>
@@ -606,13 +593,13 @@
                 <w:i w:val="0"/>
                 <w:sz w:val="19"/>
               </w:rPr>
-              <w:t>Chủ thể, phạm vi áp dụng</w:t>
+              <w:t>Tính chất</w:t>
             </w:r>
           </w:p>
         </w:tc>
         <w:tc>
           <w:tcPr>
-            <w:tcW w:type="dxa" w:w="2268"/>
+            <w:tcW w:type="dxa" w:w="1893"/>
             <w:shd w:val="clear" w:color="auto" w:fill="DCE8F7"/>
           </w:tcPr>
           <w:p>
@@ -628,7 +615,29 @@
                 <w:i w:val="0"/>
                 <w:sz w:val="19"/>
               </w:rPr>
-              <w:t>Nội dung cần cụ thể hóa</w:t>
+              <w:t>Điểm thay đổi</w:t>
+            </w:r>
+          </w:p>
+        </w:tc>
+        <w:tc>
+          <w:tcPr>
+            <w:tcW w:type="dxa" w:w="2065"/>
+            <w:shd w:val="clear" w:color="auto" w:fill="DCE8F7"/>
+          </w:tcPr>
+          <w:p>
+            <w:pPr>
+              <w:spacing w:after="0" w:line="210" w:lineRule="exact"/>
+              <w:ind w:firstLine="0"/>
+              <w:jc w:val="center"/>
+            </w:pPr>
+            <w:r/>
+            <w:r>
+              <w:rPr>
+                <w:b/>
+                <w:i w:val="0"/>
+                <w:sz w:val="19"/>
+              </w:rPr>
+              <w:t>Hệ quả quản lý</w:t>
             </w:r>
           </w:p>
         </w:tc>
@@ -639,8 +648,8 @@
         </w:trPr>
         <w:tc>
           <w:tcPr>
-            <w:tcW w:type="dxa" w:w="2268"/>
-            <w:gridSpan w:val="4"/>
+            <w:tcW w:type="dxa" w:w="2065"/>
+            <w:gridSpan w:val="5"/>
             <w:shd w:val="clear" w:color="auto" w:fill="F2F2F2"/>
           </w:tcPr>
           <w:p>
@@ -656,7 +665,7 @@
                 <w:i w:val="0"/>
                 <w:sz w:val="19"/>
               </w:rPr>
-              <w:t>Nhóm 1. Chiến lược và đánh giá</w:t>
+              <w:t>Nhóm 1. Quyền đối với kết quả và lợi ích của tác giả</w:t>
             </w:r>
           </w:p>
         </w:tc>
@@ -667,7 +676,7 @@
         </w:trPr>
         <w:tc>
           <w:tcPr>
-            <w:tcW w:type="dxa" w:w="2381"/>
+            <w:tcW w:type="dxa" w:w="1951"/>
           </w:tcPr>
           <w:p>
             <w:pPr>
@@ -682,13 +691,13 @@
                 <w:i w:val="0"/>
                 <w:sz w:val="19"/>
               </w:rPr>
-              <w:t>Kết luận số 51-KL/TW, mục 2.1</w:t>
+              <w:t>Luật số 93/2025/QH15, khoản 2 Điều 25, Điều 27; Nghị định số 267/2025/NĐ-CP, khoản 2 Điều 32</w:t>
             </w:r>
           </w:p>
         </w:tc>
         <w:tc>
           <w:tcPr>
-            <w:tcW w:type="dxa" w:w="2835"/>
+            <w:tcW w:type="dxa" w:w="2639"/>
           </w:tcPr>
           <w:p>
             <w:pPr>
@@ -703,13 +712,13 @@
                 <w:i w:val="0"/>
                 <w:sz w:val="19"/>
               </w:rPr>
-              <w:t>Sở hữu trí tuệ là cấu phần của chiến lược khoa học, công nghệ, nhân lực</w:t>
+              <w:t>Tổ chức chủ trì được giao tự động quyền sở hữu phần kết quả tương ứng kinh phí ngân sách, tự quyết phương án thương mại hóa</w:t>
             </w:r>
           </w:p>
         </w:tc>
         <w:tc>
           <w:tcPr>
-            <w:tcW w:type="dxa" w:w="2154"/>
+            <w:tcW w:type="dxa" w:w="1090"/>
           </w:tcPr>
           <w:p>
             <w:pPr>
@@ -724,13 +733,13 @@
                 <w:i w:val="0"/>
                 <w:sz w:val="19"/>
               </w:rPr>
-              <w:t>Định hướng chính sách, toàn hệ thống</w:t>
+              <w:t>Quyền</w:t>
             </w:r>
           </w:p>
         </w:tc>
         <w:tc>
           <w:tcPr>
-            <w:tcW w:type="dxa" w:w="2268"/>
+            <w:tcW w:type="dxa" w:w="1893"/>
           </w:tcPr>
           <w:p>
             <w:pPr>
@@ -745,18 +754,13 @@
                 <w:i w:val="0"/>
                 <w:sz w:val="19"/>
               </w:rPr>
-              <w:t>Mục tiêu sở hữu trí tuệ trong kế hoạch của trường</w:t>
+              <w:t>Mới: không còn thủ tục giao quyền, bàn giao tài sản; Nghị định số 70/2018/NĐ-CP hết hiệu lực</w:t>
             </w:r>
           </w:p>
         </w:tc>
-      </w:tr>
-      <w:tr>
-        <w:trPr>
-          <w:cantSplit/>
-        </w:trPr>
         <w:tc>
           <w:tcPr>
-            <w:tcW w:type="dxa" w:w="2381"/>
+            <w:tcW w:type="dxa" w:w="2065"/>
           </w:tcPr>
           <w:p>
             <w:pPr>
@@ -771,13 +775,18 @@
                 <w:i w:val="0"/>
                 <w:sz w:val="19"/>
               </w:rPr>
-              <w:t>Quyết định số 1624/QĐ-TTg, điểm b khoản 4 Mục III</w:t>
+              <w:t>Quy chế phải tự quy định ai quyết định khai thác, giá và phân chia</w:t>
             </w:r>
           </w:p>
         </w:tc>
+      </w:tr>
+      <w:tr>
+        <w:trPr>
+          <w:cantSplit/>
+        </w:trPr>
         <w:tc>
           <w:tcPr>
-            <w:tcW w:type="dxa" w:w="2835"/>
+            <w:tcW w:type="dxa" w:w="1951"/>
           </w:tcPr>
           <w:p>
             <w:pPr>
@@ -792,13 +801,13 @@
                 <w:i w:val="0"/>
                 <w:sz w:val="19"/>
               </w:rPr>
-              <w:t>Dùng chỉ số sở hữu trí tuệ để đánh giá hiệu quả hoạt động</w:t>
+              <w:t>Luật số 93/2025/QH15, khoản 3 Điều 28, khoản 3, khoản 7 Điều 73; Nghị định số 267/2025/NĐ-CP, khoản 1 Điều 34</w:t>
             </w:r>
           </w:p>
         </w:tc>
         <w:tc>
           <w:tcPr>
-            <w:tcW w:type="dxa" w:w="2154"/>
+            <w:tcW w:type="dxa" w:w="2639"/>
           </w:tcPr>
           <w:p>
             <w:pPr>
@@ -813,13 +822,13 @@
                 <w:i w:val="0"/>
                 <w:sz w:val="19"/>
               </w:rPr>
-              <w:t>Định hướng; cơ sở giáo dục đại học, viện, doanh nghiệp</w:t>
+              <w:t>Thưởng tác giả tối thiểu 30% lợi nhuận sau thuế, hoặc 30% giá trị kết quả khi góp vốn, với phần kết quả từ ngân sách</w:t>
             </w:r>
           </w:p>
         </w:tc>
         <w:tc>
           <w:tcPr>
-            <w:tcW w:type="dxa" w:w="2268"/>
+            <w:tcW w:type="dxa" w:w="1090"/>
           </w:tcPr>
           <w:p>
             <w:pPr>
@@ -834,7 +843,49 @@
                 <w:i w:val="0"/>
                 <w:sz w:val="19"/>
               </w:rPr>
-              <w:t>Bộ chỉ số, định nghĩa, nguồn dữ liệu</w:t>
+              <w:t>Nghĩa vụ</w:t>
+            </w:r>
+          </w:p>
+        </w:tc>
+        <w:tc>
+          <w:tcPr>
+            <w:tcW w:type="dxa" w:w="1893"/>
+          </w:tcPr>
+          <w:p>
+            <w:pPr>
+              <w:spacing w:after="0" w:line="210" w:lineRule="exact"/>
+              <w:ind w:firstLine="0"/>
+              <w:jc w:val="left"/>
+            </w:pPr>
+            <w:r/>
+            <w:r>
+              <w:rPr>
+                <w:b w:val="0"/>
+                <w:i w:val="0"/>
+                <w:sz w:val="19"/>
+              </w:rPr>
+              <w:t>Chế độ mới của Luật số 93/2025/QH15; nhiệm vụ phê duyệt trước 01/10/2025 giữ chế độ cũ, trừ trường hợp tại khoản 7 Điều 73</w:t>
+            </w:r>
+          </w:p>
+        </w:tc>
+        <w:tc>
+          <w:tcPr>
+            <w:tcW w:type="dxa" w:w="2065"/>
+          </w:tcPr>
+          <w:p>
+            <w:pPr>
+              <w:spacing w:after="0" w:line="210" w:lineRule="exact"/>
+              <w:ind w:firstLine="0"/>
+              <w:jc w:val="left"/>
+            </w:pPr>
+            <w:r/>
+            <w:r>
+              <w:rPr>
+                <w:b w:val="0"/>
+                <w:i w:val="0"/>
+                <w:sz w:val="19"/>
+              </w:rPr>
+              <w:t>Phân loại tài sản theo nguồn và thời điểm giao; mức trần nội bộ không được làm thưởng thấp hơn mức tối thiểu</w:t>
             </w:r>
           </w:p>
         </w:tc>
@@ -845,8 +896,228 @@
         </w:trPr>
         <w:tc>
           <w:tcPr>
-            <w:tcW w:type="dxa" w:w="2268"/>
-            <w:gridSpan w:val="4"/>
+            <w:tcW w:type="dxa" w:w="1951"/>
+          </w:tcPr>
+          <w:p>
+            <w:pPr>
+              <w:spacing w:after="0" w:line="210" w:lineRule="exact"/>
+              <w:ind w:firstLine="0"/>
+              <w:jc w:val="left"/>
+            </w:pPr>
+            <w:r/>
+            <w:r>
+              <w:rPr>
+                <w:b w:val="0"/>
+                <w:i w:val="0"/>
+                <w:sz w:val="19"/>
+              </w:rPr>
+              <w:t>Nghị định số 267/2025/NĐ-CP, điểm g khoản 2 Điều 17, khoản 3 Điều 34</w:t>
+            </w:r>
+          </w:p>
+        </w:tc>
+        <w:tc>
+          <w:tcPr>
+            <w:tcW w:type="dxa" w:w="2639"/>
+          </w:tcPr>
+          <w:p>
+            <w:pPr>
+              <w:spacing w:after="0" w:line="210" w:lineRule="exact"/>
+              <w:ind w:firstLine="0"/>
+              <w:jc w:val="left"/>
+            </w:pPr>
+            <w:r/>
+            <w:r>
+              <w:rPr>
+                <w:b w:val="0"/>
+                <w:i w:val="0"/>
+                <w:sz w:val="19"/>
+              </w:rPr>
+              <w:t>Hồ sơ đánh giá cuối kỳ có văn bản xác định mức đóng góp của thành viên; thưởng chia theo thỏa thuận giữa các đồng tác giả</w:t>
+            </w:r>
+          </w:p>
+        </w:tc>
+        <w:tc>
+          <w:tcPr>
+            <w:tcW w:type="dxa" w:w="1090"/>
+          </w:tcPr>
+          <w:p>
+            <w:pPr>
+              <w:spacing w:after="0" w:line="210" w:lineRule="exact"/>
+              <w:ind w:firstLine="0"/>
+              <w:jc w:val="left"/>
+            </w:pPr>
+            <w:r/>
+            <w:r>
+              <w:rPr>
+                <w:b w:val="0"/>
+                <w:i w:val="0"/>
+                <w:sz w:val="19"/>
+              </w:rPr>
+              <w:t>Nghĩa vụ</w:t>
+            </w:r>
+          </w:p>
+        </w:tc>
+        <w:tc>
+          <w:tcPr>
+            <w:tcW w:type="dxa" w:w="1893"/>
+          </w:tcPr>
+          <w:p>
+            <w:pPr>
+              <w:spacing w:after="0" w:line="210" w:lineRule="exact"/>
+              <w:ind w:firstLine="0"/>
+              <w:jc w:val="left"/>
+            </w:pPr>
+            <w:r/>
+            <w:r>
+              <w:rPr>
+                <w:b w:val="0"/>
+                <w:i w:val="0"/>
+                <w:sz w:val="19"/>
+              </w:rPr>
+              <w:t>Quy định của nghị định mới, hiệu lực từ 14/10/2025</w:t>
+            </w:r>
+          </w:p>
+        </w:tc>
+        <w:tc>
+          <w:tcPr>
+            <w:tcW w:type="dxa" w:w="2065"/>
+          </w:tcPr>
+          <w:p>
+            <w:pPr>
+              <w:spacing w:after="0" w:line="210" w:lineRule="exact"/>
+              <w:ind w:firstLine="0"/>
+              <w:jc w:val="left"/>
+            </w:pPr>
+            <w:r/>
+            <w:r>
+              <w:rPr>
+                <w:b w:val="0"/>
+                <w:i w:val="0"/>
+                <w:sz w:val="19"/>
+              </w:rPr>
+              <w:t>Ghi nhận đóng góp ngay trong quy trình, không chờ đến khi có nguồn thu</w:t>
+            </w:r>
+          </w:p>
+        </w:tc>
+      </w:tr>
+      <w:tr>
+        <w:trPr>
+          <w:cantSplit/>
+        </w:trPr>
+        <w:tc>
+          <w:tcPr>
+            <w:tcW w:type="dxa" w:w="1951"/>
+          </w:tcPr>
+          <w:p>
+            <w:pPr>
+              <w:spacing w:after="0" w:line="210" w:lineRule="exact"/>
+              <w:ind w:firstLine="0"/>
+              <w:jc w:val="left"/>
+            </w:pPr>
+            <w:r/>
+            <w:r>
+              <w:rPr>
+                <w:b w:val="0"/>
+                <w:i w:val="0"/>
+                <w:sz w:val="19"/>
+              </w:rPr>
+              <w:t>Luật Sở hữu trí tuệ, khoản 1 Điều 135</w:t>
+            </w:r>
+          </w:p>
+        </w:tc>
+        <w:tc>
+          <w:tcPr>
+            <w:tcW w:type="dxa" w:w="2639"/>
+          </w:tcPr>
+          <w:p>
+            <w:pPr>
+              <w:spacing w:after="0" w:line="210" w:lineRule="exact"/>
+              <w:ind w:firstLine="0"/>
+              <w:jc w:val="left"/>
+            </w:pPr>
+            <w:r/>
+            <w:r>
+              <w:rPr>
+                <w:b w:val="0"/>
+                <w:i w:val="0"/>
+                <w:sz w:val="19"/>
+              </w:rPr>
+              <w:t>Chủ sở hữu trả thù lao cho tác giả sáng chế, kiểu dáng, thiết kế bố trí theo thỏa thuận; 10% hoặc 15% khi không có thỏa thuận</w:t>
+            </w:r>
+          </w:p>
+        </w:tc>
+        <w:tc>
+          <w:tcPr>
+            <w:tcW w:type="dxa" w:w="1090"/>
+          </w:tcPr>
+          <w:p>
+            <w:pPr>
+              <w:spacing w:after="0" w:line="210" w:lineRule="exact"/>
+              <w:ind w:firstLine="0"/>
+              <w:jc w:val="left"/>
+            </w:pPr>
+            <w:r/>
+            <w:r>
+              <w:rPr>
+                <w:b w:val="0"/>
+                <w:i w:val="0"/>
+                <w:sz w:val="19"/>
+              </w:rPr>
+              <w:t>Nghĩa vụ</w:t>
+            </w:r>
+          </w:p>
+        </w:tc>
+        <w:tc>
+          <w:tcPr>
+            <w:tcW w:type="dxa" w:w="1893"/>
+          </w:tcPr>
+          <w:p>
+            <w:pPr>
+              <w:spacing w:after="0" w:line="210" w:lineRule="exact"/>
+              <w:ind w:firstLine="0"/>
+              <w:jc w:val="left"/>
+            </w:pPr>
+            <w:r/>
+            <w:r>
+              <w:rPr>
+                <w:b w:val="0"/>
+                <w:i w:val="0"/>
+                <w:sz w:val="19"/>
+              </w:rPr>
+              <w:t>Sửa đổi: quy định riêng cho kết quả từ ngân sách bị bãi bỏ</w:t>
+            </w:r>
+          </w:p>
+        </w:tc>
+        <w:tc>
+          <w:tcPr>
+            <w:tcW w:type="dxa" w:w="2065"/>
+          </w:tcPr>
+          <w:p>
+            <w:pPr>
+              <w:spacing w:after="0" w:line="210" w:lineRule="exact"/>
+              <w:ind w:firstLine="0"/>
+              <w:jc w:val="left"/>
+            </w:pPr>
+            <w:r/>
+            <w:r>
+              <w:rPr>
+                <w:b w:val="0"/>
+                <w:i w:val="0"/>
+                <w:sz w:val="19"/>
+              </w:rPr>
+              <w:t>Tách thù lao khỏi thưởng; nêu rõ quy chế, hợp đồng có phải là thỏa thuận về thù lao</w:t>
+            </w:r>
+          </w:p>
+        </w:tc>
+      </w:tr>
+      <w:tr>
+        <w:trPr>
+          <w:cantSplit/>
+        </w:trPr>
+        <w:tc>
+          <w:tcPr>
+            <w:tcW w:type="dxa" w:w="2065"/>
+            <w:gridSpan w:val="5"/>
             <w:shd w:val="clear" w:color="auto" w:fill="F2F2F2"/>
           </w:tcPr>
           <w:p>
@@ -862,7 +1133,7 @@
                 <w:i w:val="0"/>
                 <w:sz w:val="19"/>
               </w:rPr>
-              <w:t>Nhóm 2. Nhận diện, bảo hộ gắn với nghiên cứu, công bố</w:t>
+              <w:t>Nhóm 2. Bảo hộ gắn với nghiên cứu và công bố</w:t>
             </w:r>
           </w:p>
         </w:tc>
@@ -873,7 +1144,7 @@
         </w:trPr>
         <w:tc>
           <w:tcPr>
-            <w:tcW w:type="dxa" w:w="2381"/>
+            <w:tcW w:type="dxa" w:w="1951"/>
           </w:tcPr>
           <w:p>
             <w:pPr>
@@ -888,13 +1159,13 @@
                 <w:i w:val="0"/>
                 <w:sz w:val="19"/>
               </w:rPr>
-              <w:t>Quyết định số 1624/QĐ-TTg, điểm b khoản 4 Mục III</w:t>
+              <w:t>Quyết định số 1068/QĐ-TTg, điểm b khoản 4 Mục III, được Quyết định số 1624/QĐ-TTg giữ lại</w:t>
             </w:r>
           </w:p>
         </w:tc>
         <w:tc>
           <w:tcPr>
-            <w:tcW w:type="dxa" w:w="2835"/>
+            <w:tcW w:type="dxa" w:w="2639"/>
           </w:tcPr>
           <w:p>
             <w:pPr>
@@ -909,13 +1180,13 @@
                 <w:i w:val="0"/>
                 <w:sz w:val="19"/>
               </w:rPr>
-              <w:t>Xác định đối tượng quyền cần đạt; đăng ký bảo hộ đồng thời với công bố</w:t>
+              <w:t>Dùng chỉ số sở hữu trí tuệ để đánh giá; xác định đối tượng quyền cần đạt; trường khối kỹ thuật đăng ký đồng thời với công bố</w:t>
             </w:r>
           </w:p>
         </w:tc>
         <w:tc>
           <w:tcPr>
-            <w:tcW w:type="dxa" w:w="2154"/>
+            <w:tcW w:type="dxa" w:w="1090"/>
           </w:tcPr>
           <w:p>
             <w:pPr>
@@ -930,13 +1201,13 @@
                 <w:i w:val="0"/>
                 <w:sz w:val="19"/>
               </w:rPr>
-              <w:t>Kết quả dùng ngân sách nhà nước; khối kỹ thuật, công nghệ</w:t>
+              <w:t>Định hướng</w:t>
             </w:r>
           </w:p>
         </w:tc>
         <w:tc>
           <w:tcPr>
-            <w:tcW w:type="dxa" w:w="2268"/>
+            <w:tcW w:type="dxa" w:w="1893"/>
           </w:tcPr>
           <w:p>
             <w:pPr>
@@ -951,18 +1222,13 @@
                 <w:i w:val="0"/>
                 <w:sz w:val="19"/>
               </w:rPr>
-              <w:t>Khai báo từ khâu đề xuất; sàng lọc trước công bố</w:t>
+              <w:t>Kế thừa từ năm 2019</w:t>
             </w:r>
           </w:p>
         </w:tc>
-      </w:tr>
-      <w:tr>
-        <w:trPr>
-          <w:cantSplit/>
-        </w:trPr>
         <w:tc>
           <w:tcPr>
-            <w:tcW w:type="dxa" w:w="2381"/>
+            <w:tcW w:type="dxa" w:w="2065"/>
           </w:tcPr>
           <w:p>
             <w:pPr>
@@ -977,13 +1243,18 @@
                 <w:i w:val="0"/>
                 <w:sz w:val="19"/>
               </w:rPr>
-              <w:t>Luật Sở hữu trí tuệ, khoản 3 Điều 60, khoản 4 Điều 65, điểm c khoản 1 Điều 86</w:t>
+              <w:t>Khai báo từ thuyết minh; quyết định nộp đơn trước công bố</w:t>
             </w:r>
           </w:p>
         </w:tc>
+      </w:tr>
+      <w:tr>
+        <w:trPr>
+          <w:cantSplit/>
+        </w:trPr>
         <w:tc>
           <w:tcPr>
-            <w:tcW w:type="dxa" w:w="2835"/>
+            <w:tcW w:type="dxa" w:w="1951"/>
           </w:tcPr>
           <w:p>
             <w:pPr>
@@ -998,13 +1269,13 @@
                 <w:i w:val="0"/>
                 <w:sz w:val="19"/>
               </w:rPr>
-              <w:t>Ân hạn 12 tháng với sáng chế, 6 tháng với kiểu dáng; quyền đăng ký của tổ chức được giao kết quả</w:t>
+              <w:t>Luật Sở hữu trí tuệ, khoản 3 Điều 60</w:t>
             </w:r>
           </w:p>
         </w:tc>
         <w:tc>
           <w:tcPr>
-            <w:tcW w:type="dxa" w:w="2154"/>
+            <w:tcW w:type="dxa" w:w="2639"/>
           </w:tcPr>
           <w:p>
             <w:pPr>
@@ -1019,13 +1290,13 @@
                 <w:i w:val="0"/>
                 <w:sz w:val="19"/>
               </w:rPr>
-              <w:t>Nghĩa vụ pháp lý, điều kiện bảo hộ</w:t>
+              <w:t>Sáng chế không mất tính mới nếu người có quyền đăng ký, hoặc người có thông tin từ người đó, bộc lộ công khai và đơn được nộp tại Việt Nam trong 12 tháng</w:t>
             </w:r>
           </w:p>
         </w:tc>
         <w:tc>
           <w:tcPr>
-            <w:tcW w:type="dxa" w:w="2268"/>
+            <w:tcW w:type="dxa" w:w="1090"/>
           </w:tcPr>
           <w:p>
             <w:pPr>
@@ -1040,7 +1311,49 @@
                 <w:i w:val="0"/>
                 <w:sz w:val="19"/>
               </w:rPr>
-              <w:t>Lịch công bố; ghi nhận ngày bộc lộ; thẩm quyền nộp đơn</w:t>
+              <w:t>Điều kiện pháp lý</w:t>
+            </w:r>
+          </w:p>
+        </w:tc>
+        <w:tc>
+          <w:tcPr>
+            <w:tcW w:type="dxa" w:w="1893"/>
+          </w:tcPr>
+          <w:p>
+            <w:pPr>
+              <w:spacing w:after="0" w:line="210" w:lineRule="exact"/>
+              <w:ind w:firstLine="0"/>
+              <w:jc w:val="left"/>
+            </w:pPr>
+            <w:r/>
+            <w:r>
+              <w:rPr>
+                <w:b w:val="0"/>
+                <w:i w:val="0"/>
+                <w:sz w:val="19"/>
+              </w:rPr>
+              <w:t>Kế thừa, sửa đổi năm 2019</w:t>
+            </w:r>
+          </w:p>
+        </w:tc>
+        <w:tc>
+          <w:tcPr>
+            <w:tcW w:type="dxa" w:w="2065"/>
+          </w:tcPr>
+          <w:p>
+            <w:pPr>
+              <w:spacing w:after="0" w:line="210" w:lineRule="exact"/>
+              <w:ind w:firstLine="0"/>
+              <w:jc w:val="left"/>
+            </w:pPr>
+            <w:r/>
+            <w:r>
+              <w:rPr>
+                <w:b w:val="0"/>
+                <w:i w:val="0"/>
+                <w:sz w:val="19"/>
+              </w:rPr>
+              <w:t>Ghi ngày bộc lộ; chỉ dùng như phương án dự phòng</w:t>
             </w:r>
           </w:p>
         </w:tc>
@@ -1051,8 +1364,228 @@
         </w:trPr>
         <w:tc>
           <w:tcPr>
-            <w:tcW w:type="dxa" w:w="2268"/>
-            <w:gridSpan w:val="4"/>
+            <w:tcW w:type="dxa" w:w="1951"/>
+          </w:tcPr>
+          <w:p>
+            <w:pPr>
+              <w:spacing w:after="0" w:line="210" w:lineRule="exact"/>
+              <w:ind w:firstLine="0"/>
+              <w:jc w:val="left"/>
+            </w:pPr>
+            <w:r/>
+            <w:r>
+              <w:rPr>
+                <w:b w:val="0"/>
+                <w:i w:val="0"/>
+                <w:sz w:val="19"/>
+              </w:rPr>
+              <w:t>Luật Sở hữu trí tuệ, khoản 4 Điều 65</w:t>
+            </w:r>
+          </w:p>
+        </w:tc>
+        <w:tc>
+          <w:tcPr>
+            <w:tcW w:type="dxa" w:w="2639"/>
+          </w:tcPr>
+          <w:p>
+            <w:pPr>
+              <w:spacing w:after="0" w:line="210" w:lineRule="exact"/>
+              <w:ind w:firstLine="0"/>
+              <w:jc w:val="left"/>
+            </w:pPr>
+            <w:r/>
+            <w:r>
+              <w:rPr>
+                <w:b w:val="0"/>
+                <w:i w:val="0"/>
+                <w:sz w:val="19"/>
+              </w:rPr>
+              <w:t>Kiểu dáng không mất tính mới khi bộc lộ như trên nếu đơn được nộp trong 6 tháng</w:t>
+            </w:r>
+          </w:p>
+        </w:tc>
+        <w:tc>
+          <w:tcPr>
+            <w:tcW w:type="dxa" w:w="1090"/>
+          </w:tcPr>
+          <w:p>
+            <w:pPr>
+              <w:spacing w:after="0" w:line="210" w:lineRule="exact"/>
+              <w:ind w:firstLine="0"/>
+              <w:jc w:val="left"/>
+            </w:pPr>
+            <w:r/>
+            <w:r>
+              <w:rPr>
+                <w:b w:val="0"/>
+                <w:i w:val="0"/>
+                <w:sz w:val="19"/>
+              </w:rPr>
+              <w:t>Điều kiện pháp lý</w:t>
+            </w:r>
+          </w:p>
+        </w:tc>
+        <w:tc>
+          <w:tcPr>
+            <w:tcW w:type="dxa" w:w="1893"/>
+          </w:tcPr>
+          <w:p>
+            <w:pPr>
+              <w:spacing w:after="0" w:line="210" w:lineRule="exact"/>
+              <w:ind w:firstLine="0"/>
+              <w:jc w:val="left"/>
+            </w:pPr>
+            <w:r/>
+            <w:r>
+              <w:rPr>
+                <w:b w:val="0"/>
+                <w:i w:val="0"/>
+                <w:sz w:val="19"/>
+              </w:rPr>
+              <w:t>Sửa đổi bởi Luật số 131/2025/QH15, hiệu lực từ 01/4/2026</w:t>
+            </w:r>
+          </w:p>
+        </w:tc>
+        <w:tc>
+          <w:tcPr>
+            <w:tcW w:type="dxa" w:w="2065"/>
+          </w:tcPr>
+          <w:p>
+            <w:pPr>
+              <w:spacing w:after="0" w:line="210" w:lineRule="exact"/>
+              <w:ind w:firstLine="0"/>
+              <w:jc w:val="left"/>
+            </w:pPr>
+            <w:r/>
+            <w:r>
+              <w:rPr>
+                <w:b w:val="0"/>
+                <w:i w:val="0"/>
+                <w:sz w:val="19"/>
+              </w:rPr>
+              <w:t>Đưa lịch trưng bày, giới thiệu sản phẩm vào sàng lọc</w:t>
+            </w:r>
+          </w:p>
+        </w:tc>
+      </w:tr>
+      <w:tr>
+        <w:trPr>
+          <w:cantSplit/>
+        </w:trPr>
+        <w:tc>
+          <w:tcPr>
+            <w:tcW w:type="dxa" w:w="1951"/>
+          </w:tcPr>
+          <w:p>
+            <w:pPr>
+              <w:spacing w:after="0" w:line="210" w:lineRule="exact"/>
+              <w:ind w:firstLine="0"/>
+              <w:jc w:val="left"/>
+            </w:pPr>
+            <w:r/>
+            <w:r>
+              <w:rPr>
+                <w:b w:val="0"/>
+                <w:i w:val="0"/>
+                <w:sz w:val="19"/>
+              </w:rPr>
+              <w:t>Luật Sở hữu trí tuệ, điểm c khoản 1 Điều 86; Nghị định số 267/2025/NĐ-CP, khoản 6 Điều 32</w:t>
+            </w:r>
+          </w:p>
+        </w:tc>
+        <w:tc>
+          <w:tcPr>
+            <w:tcW w:type="dxa" w:w="2639"/>
+          </w:tcPr>
+          <w:p>
+            <w:pPr>
+              <w:spacing w:after="0" w:line="210" w:lineRule="exact"/>
+              <w:ind w:firstLine="0"/>
+              <w:jc w:val="left"/>
+            </w:pPr>
+            <w:r/>
+            <w:r>
+              <w:rPr>
+                <w:b w:val="0"/>
+                <w:i w:val="0"/>
+                <w:sz w:val="19"/>
+              </w:rPr>
+              <w:t>Tổ chức được giao quyền có quyền đăng ký sáng chế, kiểu dáng, thiết kế bố trí</w:t>
+            </w:r>
+          </w:p>
+        </w:tc>
+        <w:tc>
+          <w:tcPr>
+            <w:tcW w:type="dxa" w:w="1090"/>
+          </w:tcPr>
+          <w:p>
+            <w:pPr>
+              <w:spacing w:after="0" w:line="210" w:lineRule="exact"/>
+              <w:ind w:firstLine="0"/>
+              <w:jc w:val="left"/>
+            </w:pPr>
+            <w:r/>
+            <w:r>
+              <w:rPr>
+                <w:b w:val="0"/>
+                <w:i w:val="0"/>
+                <w:sz w:val="19"/>
+              </w:rPr>
+              <w:t>Quyền</w:t>
+            </w:r>
+          </w:p>
+        </w:tc>
+        <w:tc>
+          <w:tcPr>
+            <w:tcW w:type="dxa" w:w="1893"/>
+          </w:tcPr>
+          <w:p>
+            <w:pPr>
+              <w:spacing w:after="0" w:line="210" w:lineRule="exact"/>
+              <w:ind w:firstLine="0"/>
+              <w:jc w:val="left"/>
+            </w:pPr>
+            <w:r/>
+            <w:r>
+              <w:rPr>
+                <w:b w:val="0"/>
+                <w:i w:val="0"/>
+                <w:sz w:val="19"/>
+              </w:rPr>
+              <w:t>Sửa đổi: Điều 86a bãi bỏ, nội dung chuyển vào Điều 86, gắn với giao quyền tự động</w:t>
+            </w:r>
+          </w:p>
+        </w:tc>
+        <w:tc>
+          <w:tcPr>
+            <w:tcW w:type="dxa" w:w="2065"/>
+          </w:tcPr>
+          <w:p>
+            <w:pPr>
+              <w:spacing w:after="0" w:line="210" w:lineRule="exact"/>
+              <w:ind w:firstLine="0"/>
+              <w:jc w:val="left"/>
+            </w:pPr>
+            <w:r/>
+            <w:r>
+              <w:rPr>
+                <w:b w:val="0"/>
+                <w:i w:val="0"/>
+                <w:sz w:val="19"/>
+              </w:rPr>
+              <w:t>Xác định người ký đơn và trình tự quyết định nộp đơn</w:t>
+            </w:r>
+          </w:p>
+        </w:tc>
+      </w:tr>
+      <w:tr>
+        <w:trPr>
+          <w:cantSplit/>
+        </w:trPr>
+        <w:tc>
+          <w:tcPr>
+            <w:tcW w:type="dxa" w:w="2065"/>
+            <w:gridSpan w:val="5"/>
             <w:shd w:val="clear" w:color="auto" w:fill="F2F2F2"/>
           </w:tcPr>
           <w:p>
@@ -1068,7 +1601,7 @@
                 <w:i w:val="0"/>
                 <w:sz w:val="19"/>
               </w:rPr>
-              <w:t>Nhóm 3. Năng lực hỗ trợ, khai thác</w:t>
+              <w:t>Nhóm 3. Tổ chức hỗ trợ và khai thác</w:t>
             </w:r>
           </w:p>
         </w:tc>
@@ -1079,7 +1612,7 @@
         </w:trPr>
         <w:tc>
           <w:tcPr>
-            <w:tcW w:type="dxa" w:w="2381"/>
+            <w:tcW w:type="dxa" w:w="1951"/>
           </w:tcPr>
           <w:p>
             <w:pPr>
@@ -1094,13 +1627,13 @@
                 <w:i w:val="0"/>
                 <w:sz w:val="19"/>
               </w:rPr>
-              <w:t>Quyết định số 1068/QĐ-TTg, khoản 5 Mục III; Quyết định số 1624/QĐ-TTg, khoản 5 Mục II, khoản 6 Mục III</w:t>
+              <w:t>Quyết định số 1624/QĐ-TTg, điểm a khoản 6 Mục III, điểm đ khoản 5 Mục II</w:t>
             </w:r>
           </w:p>
         </w:tc>
         <w:tc>
           <w:tcPr>
-            <w:tcW w:type="dxa" w:w="2835"/>
+            <w:tcW w:type="dxa" w:w="2639"/>
           </w:tcPr>
           <w:p>
             <w:pPr>
@@ -1115,13 +1648,13 @@
                 <w:i w:val="0"/>
                 <w:sz w:val="19"/>
               </w:rPr>
-              <w:t>Trung tâm chuyển giao, tư vấn, định giá; doanh nghiệp khai thác; thí điểm định giá ít nhất 100 quyền</w:t>
+              <w:t>Phát triển trung tâm tư vấn, hỗ trợ định giá, khai thác thương mại trong cơ sở giáo dục đại học; thí điểm định giá ít nhất 100 quyền</w:t>
             </w:r>
           </w:p>
         </w:tc>
         <w:tc>
           <w:tcPr>
-            <w:tcW w:type="dxa" w:w="2154"/>
+            <w:tcW w:type="dxa" w:w="1090"/>
           </w:tcPr>
           <w:p>
             <w:pPr>
@@ -1136,13 +1669,13 @@
                 <w:i w:val="0"/>
                 <w:sz w:val="19"/>
               </w:rPr>
-              <w:t>Định hướng; cơ sở giáo dục đại học, viện</w:t>
+              <w:t>Định hướng</w:t>
             </w:r>
           </w:p>
         </w:tc>
         <w:tc>
           <w:tcPr>
-            <w:tcW w:type="dxa" w:w="2268"/>
+            <w:tcW w:type="dxa" w:w="1893"/>
           </w:tcPr>
           <w:p>
             <w:pPr>
@@ -1157,7 +1690,28 @@
                 <w:i w:val="0"/>
                 <w:sz w:val="19"/>
               </w:rPr>
-              <w:t>Đầu mối hỗ trợ; phương án tổ chức phù hợp quy mô</w:t>
+              <w:t>Sửa đổi: trước chỉ nêu trung tâm tư vấn; nay thêm định giá, khai thác</w:t>
+            </w:r>
+          </w:p>
+        </w:tc>
+        <w:tc>
+          <w:tcPr>
+            <w:tcW w:type="dxa" w:w="2065"/>
+          </w:tcPr>
+          <w:p>
+            <w:pPr>
+              <w:spacing w:after="0" w:line="210" w:lineRule="exact"/>
+              <w:ind w:firstLine="0"/>
+              <w:jc w:val="left"/>
+            </w:pPr>
+            <w:r/>
+            <w:r>
+              <w:rPr>
+                <w:b w:val="0"/>
+                <w:i w:val="0"/>
+                <w:sz w:val="19"/>
+              </w:rPr>
+              <w:t>Phân công chức năng định giá, khai thác; có thể thuê ngoài</w:t>
             </w:r>
           </w:p>
         </w:tc>
@@ -1168,7 +1722,7 @@
         </w:trPr>
         <w:tc>
           <w:tcPr>
-            <w:tcW w:type="dxa" w:w="2381"/>
+            <w:tcW w:type="dxa" w:w="1951"/>
           </w:tcPr>
           <w:p>
             <w:pPr>
@@ -1189,7 +1743,7 @@
         </w:tc>
         <w:tc>
           <w:tcPr>
-            <w:tcW w:type="dxa" w:w="2835"/>
+            <w:tcW w:type="dxa" w:w="2639"/>
           </w:tcPr>
           <w:p>
             <w:pPr>
@@ -1204,13 +1758,13 @@
                 <w:i w:val="0"/>
                 <w:sz w:val="19"/>
               </w:rPr>
-              <w:t>Thành lập doanh nghiệp quản lý tài sản trí tuệ; định giá, khai thác, góp vốn, phân chia lợi ích</w:t>
+              <w:t>Được thành lập doanh nghiệp quản lý tài sản trí tuệ; định giá, góp vốn, phân chia lợi ích</w:t>
             </w:r>
           </w:p>
         </w:tc>
         <w:tc>
           <w:tcPr>
-            <w:tcW w:type="dxa" w:w="2154"/>
+            <w:tcW w:type="dxa" w:w="1090"/>
           </w:tcPr>
           <w:p>
             <w:pPr>
@@ -1225,13 +1779,13 @@
                 <w:i w:val="0"/>
                 <w:sz w:val="19"/>
               </w:rPr>
-              <w:t>Quyền được trao</w:t>
+              <w:t>Quyền</w:t>
             </w:r>
           </w:p>
         </w:tc>
         <w:tc>
           <w:tcPr>
-            <w:tcW w:type="dxa" w:w="2268"/>
+            <w:tcW w:type="dxa" w:w="1893"/>
           </w:tcPr>
           <w:p>
             <w:pPr>
@@ -1246,7 +1800,28 @@
                 <w:i w:val="0"/>
                 <w:sz w:val="19"/>
               </w:rPr>
-              <w:t>Thẩm quyền, điều kiện lựa chọn hình thức tổ chức</w:t>
+              <w:t>Quy định của luật mới, hiệu lực từ 01/01/2026</w:t>
+            </w:r>
+          </w:p>
+        </w:tc>
+        <w:tc>
+          <w:tcPr>
+            <w:tcW w:type="dxa" w:w="2065"/>
+          </w:tcPr>
+          <w:p>
+            <w:pPr>
+              <w:spacing w:after="0" w:line="210" w:lineRule="exact"/>
+              <w:ind w:firstLine="0"/>
+              <w:jc w:val="left"/>
+            </w:pPr>
+            <w:r/>
+            <w:r>
+              <w:rPr>
+                <w:b w:val="0"/>
+                <w:i w:val="0"/>
+                <w:sz w:val="19"/>
+              </w:rPr>
+              <w:t>Lựa chọn khi đủ điều kiện, không bắt buộc</w:t>
             </w:r>
           </w:p>
         </w:tc>
@@ -1257,8 +1832,118 @@
         </w:trPr>
         <w:tc>
           <w:tcPr>
-            <w:tcW w:type="dxa" w:w="2268"/>
-            <w:gridSpan w:val="4"/>
+            <w:tcW w:type="dxa" w:w="1951"/>
+          </w:tcPr>
+          <w:p>
+            <w:pPr>
+              <w:spacing w:after="0" w:line="210" w:lineRule="exact"/>
+              <w:ind w:firstLine="0"/>
+              <w:jc w:val="left"/>
+            </w:pPr>
+            <w:r/>
+            <w:r>
+              <w:rPr>
+                <w:b w:val="0"/>
+                <w:i w:val="0"/>
+                <w:sz w:val="19"/>
+              </w:rPr>
+              <w:t>Nghị định số 267/2025/NĐ-CP, khoản 2 Điều 34</w:t>
+            </w:r>
+          </w:p>
+        </w:tc>
+        <w:tc>
+          <w:tcPr>
+            <w:tcW w:type="dxa" w:w="2639"/>
+          </w:tcPr>
+          <w:p>
+            <w:pPr>
+              <w:spacing w:after="0" w:line="210" w:lineRule="exact"/>
+              <w:ind w:firstLine="0"/>
+              <w:jc w:val="left"/>
+            </w:pPr>
+            <w:r/>
+            <w:r>
+              <w:rPr>
+                <w:b w:val="0"/>
+                <w:i w:val="0"/>
+                <w:sz w:val="19"/>
+              </w:rPr>
+              <w:t>Tổ chức trung gian, môi giới hưởng tối thiểu 10% lợi nhuận khi các bên không có thỏa thuận khác</w:t>
+            </w:r>
+          </w:p>
+        </w:tc>
+        <w:tc>
+          <w:tcPr>
+            <w:tcW w:type="dxa" w:w="1090"/>
+          </w:tcPr>
+          <w:p>
+            <w:pPr>
+              <w:spacing w:after="0" w:line="210" w:lineRule="exact"/>
+              <w:ind w:firstLine="0"/>
+              <w:jc w:val="left"/>
+            </w:pPr>
+            <w:r/>
+            <w:r>
+              <w:rPr>
+                <w:b w:val="0"/>
+                <w:i w:val="0"/>
+                <w:sz w:val="19"/>
+              </w:rPr>
+              <w:t>Nghĩa vụ áp dụng khi không có thỏa thuận</w:t>
+            </w:r>
+          </w:p>
+        </w:tc>
+        <w:tc>
+          <w:tcPr>
+            <w:tcW w:type="dxa" w:w="1893"/>
+          </w:tcPr>
+          <w:p>
+            <w:pPr>
+              <w:spacing w:after="0" w:line="210" w:lineRule="exact"/>
+              <w:ind w:firstLine="0"/>
+              <w:jc w:val="left"/>
+            </w:pPr>
+            <w:r/>
+            <w:r>
+              <w:rPr>
+                <w:b w:val="0"/>
+                <w:i w:val="0"/>
+                <w:sz w:val="19"/>
+              </w:rPr>
+              <w:t>Quy định của nghị định mới</w:t>
+            </w:r>
+          </w:p>
+        </w:tc>
+        <w:tc>
+          <w:tcPr>
+            <w:tcW w:type="dxa" w:w="2065"/>
+          </w:tcPr>
+          <w:p>
+            <w:pPr>
+              <w:spacing w:after="0" w:line="210" w:lineRule="exact"/>
+              <w:ind w:firstLine="0"/>
+              <w:jc w:val="left"/>
+            </w:pPr>
+            <w:r/>
+            <w:r>
+              <w:rPr>
+                <w:b w:val="0"/>
+                <w:i w:val="0"/>
+                <w:sz w:val="19"/>
+              </w:rPr>
+              <w:t>Hợp đồng thuê tư vấn, môi giới phải thỏa thuận mức hưởng</w:t>
+            </w:r>
+          </w:p>
+        </w:tc>
+      </w:tr>
+      <w:tr>
+        <w:trPr>
+          <w:cantSplit/>
+        </w:trPr>
+        <w:tc>
+          <w:tcPr>
+            <w:tcW w:type="dxa" w:w="2065"/>
+            <w:gridSpan w:val="5"/>
             <w:shd w:val="clear" w:color="auto" w:fill="F2F2F2"/>
           </w:tcPr>
           <w:p>
@@ -1274,7 +1959,7 @@
                 <w:i w:val="0"/>
                 <w:sz w:val="19"/>
               </w:rPr>
-              <w:t>Nhóm 4. Lợi ích, dữ liệu, trách nhiệm giải trình</w:t>
+              <w:t>Nhóm 4. Kinh phí và công khai</w:t>
             </w:r>
           </w:p>
         </w:tc>
@@ -1285,7 +1970,7 @@
         </w:trPr>
         <w:tc>
           <w:tcPr>
-            <w:tcW w:type="dxa" w:w="2381"/>
+            <w:tcW w:type="dxa" w:w="1951"/>
           </w:tcPr>
           <w:p>
             <w:pPr>
@@ -1300,13 +1985,13 @@
                 <w:i w:val="0"/>
                 <w:sz w:val="19"/>
               </w:rPr>
-              <w:t>Luật số 93/2025/QH15, khoản 2 Điều 25, Điều 27, Điều 28, khoản 3, khoản 7 Điều 73</w:t>
+              <w:t>Luật số 125/2025/QH15, điểm d khoản 3 Điều 28</w:t>
             </w:r>
           </w:p>
         </w:tc>
         <w:tc>
           <w:tcPr>
-            <w:tcW w:type="dxa" w:w="2835"/>
+            <w:tcW w:type="dxa" w:w="2639"/>
           </w:tcPr>
           <w:p>
             <w:pPr>
@@ -1321,13 +2006,13 @@
                 <w:i w:val="0"/>
                 <w:sz w:val="19"/>
               </w:rPr>
-              <w:t>Tự động giao quyền; tự quyết thương mại hóa; thưởng tác giả tối thiểu 30% lợi nhuận sau thuế với phần ngân sách; công khai, báo cáo</w:t>
+              <w:t>Thành lập và vận hành quỹ phát triển khoa học và công nghệ</w:t>
             </w:r>
           </w:p>
         </w:tc>
         <w:tc>
           <w:tcPr>
-            <w:tcW w:type="dxa" w:w="2154"/>
+            <w:tcW w:type="dxa" w:w="1090"/>
           </w:tcPr>
           <w:p>
             <w:pPr>
@@ -1342,13 +2027,13 @@
                 <w:i w:val="0"/>
                 <w:sz w:val="19"/>
               </w:rPr>
-              <w:t>Nghĩa vụ pháp lý theo nguồn kinh phí, thời điểm giao nhiệm vụ</w:t>
+              <w:t>Nghĩa vụ</w:t>
             </w:r>
           </w:p>
         </w:tc>
         <w:tc>
           <w:tcPr>
-            <w:tcW w:type="dxa" w:w="2268"/>
+            <w:tcW w:type="dxa" w:w="1893"/>
           </w:tcPr>
           <w:p>
             <w:pPr>
@@ -1363,18 +2048,13 @@
                 <w:i w:val="0"/>
                 <w:sz w:val="19"/>
               </w:rPr>
-              <w:t>Cơ chế lợi ích theo nguồn, thời điểm, đối tượng; báo cáo</w:t>
+              <w:t>Quy định của luật mới</w:t>
             </w:r>
           </w:p>
         </w:tc>
-      </w:tr>
-      <w:tr>
-        <w:trPr>
-          <w:cantSplit/>
-        </w:trPr>
         <w:tc>
           <w:tcPr>
-            <w:tcW w:type="dxa" w:w="2381"/>
+            <w:tcW w:type="dxa" w:w="2065"/>
           </w:tcPr>
           <w:p>
             <w:pPr>
@@ -1389,13 +2069,18 @@
                 <w:i w:val="0"/>
                 <w:sz w:val="19"/>
               </w:rPr>
-              <w:t>Luật Sở hữu trí tuệ, khoản 1 Điều 135</w:t>
+              <w:t>Dòng dự toán cho xác lập quyền đặt trong quỹ</w:t>
             </w:r>
           </w:p>
         </w:tc>
+      </w:tr>
+      <w:tr>
+        <w:trPr>
+          <w:cantSplit/>
+        </w:trPr>
         <w:tc>
           <w:tcPr>
-            <w:tcW w:type="dxa" w:w="2835"/>
+            <w:tcW w:type="dxa" w:w="1951"/>
           </w:tcPr>
           <w:p>
             <w:pPr>
@@ -1410,13 +2095,13 @@
                 <w:i w:val="0"/>
                 <w:sz w:val="19"/>
               </w:rPr>
-              <w:t>Thù lao cho tác giả sáng chế, kiểu dáng, thiết kế bố trí theo thỏa thuận; mặc định 10% hoặc 15%</w:t>
+              <w:t>Luật số 93/2025/QH15, điểm b khoản 2 Điều 66</w:t>
             </w:r>
           </w:p>
         </w:tc>
         <w:tc>
           <w:tcPr>
-            <w:tcW w:type="dxa" w:w="2154"/>
+            <w:tcW w:type="dxa" w:w="2639"/>
           </w:tcPr>
           <w:p>
             <w:pPr>
@@ -1431,13 +2116,13 @@
                 <w:i w:val="0"/>
                 <w:sz w:val="19"/>
               </w:rPr>
-              <w:t>Chủ sở hữu văn bằng; nghĩa vụ pháp lý</w:t>
+              <w:t>Quỹ được chi cho đăng ký, bảo hộ, quản lý, khai thác quyền sở hữu trí tuệ</w:t>
             </w:r>
           </w:p>
         </w:tc>
         <w:tc>
           <w:tcPr>
-            <w:tcW w:type="dxa" w:w="2268"/>
+            <w:tcW w:type="dxa" w:w="1090"/>
           </w:tcPr>
           <w:p>
             <w:pPr>
@@ -1452,18 +2137,13 @@
                 <w:i w:val="0"/>
                 <w:sz w:val="19"/>
               </w:rPr>
-              <w:t>Tách thù lao khỏi thưởng; xác định thỏa thuận</w:t>
+              <w:t>Quyền</w:t>
             </w:r>
           </w:p>
         </w:tc>
-      </w:tr>
-      <w:tr>
-        <w:trPr>
-          <w:cantSplit/>
-        </w:trPr>
         <w:tc>
           <w:tcPr>
-            <w:tcW w:type="dxa" w:w="2381"/>
+            <w:tcW w:type="dxa" w:w="1893"/>
           </w:tcPr>
           <w:p>
             <w:pPr>
@@ -1478,13 +2158,13 @@
                 <w:i w:val="0"/>
                 <w:sz w:val="19"/>
               </w:rPr>
-              <w:t>Luật số 93/2025/QH15, Điều 66; Luật số 125/2025/QH15, khoản 3 Điều 28</w:t>
+              <w:t>Quy định của luật mới, hiệu lực từ 01/10/2025</w:t>
             </w:r>
           </w:p>
         </w:tc>
         <w:tc>
           <w:tcPr>
-            <w:tcW w:type="dxa" w:w="2835"/>
+            <w:tcW w:type="dxa" w:w="2065"/>
           </w:tcPr>
           <w:p>
             <w:pPr>
@@ -1499,13 +2179,18 @@
                 <w:i w:val="0"/>
                 <w:sz w:val="19"/>
               </w:rPr>
-              <w:t>Quỹ phát triển khoa học và công nghệ được chi cho đăng ký, bảo hộ; công khai hằng năm</w:t>
+              <w:t>Căn cứ chi cho đơn nộp trong khi đề tài đang thực hiện</w:t>
             </w:r>
           </w:p>
         </w:tc>
+      </w:tr>
+      <w:tr>
+        <w:trPr>
+          <w:cantSplit/>
+        </w:trPr>
         <w:tc>
           <w:tcPr>
-            <w:tcW w:type="dxa" w:w="2154"/>
+            <w:tcW w:type="dxa" w:w="1951"/>
           </w:tcPr>
           <w:p>
             <w:pPr>
@@ -1520,13 +2205,13 @@
                 <w:i w:val="0"/>
                 <w:sz w:val="19"/>
               </w:rPr>
-              <w:t>Tổ chức có quỹ; cơ sở giáo dục đại học</w:t>
+              <w:t>Luật số 125/2025/QH15, điểm đ khoản 3 Điều 28</w:t>
             </w:r>
           </w:p>
         </w:tc>
         <w:tc>
           <w:tcPr>
-            <w:tcW w:type="dxa" w:w="2268"/>
+            <w:tcW w:type="dxa" w:w="2639"/>
           </w:tcPr>
           <w:p>
             <w:pPr>
@@ -1541,7 +2226,70 @@
                 <w:i w:val="0"/>
                 <w:sz w:val="19"/>
               </w:rPr>
-              <w:t>Dòng kinh phí cho xác lập quyền; danh mục số</w:t>
+              <w:t>Công khai năng lực, kết quả; cập nhật hằng năm trên nền tảng số quốc gia</w:t>
+            </w:r>
+          </w:p>
+        </w:tc>
+        <w:tc>
+          <w:tcPr>
+            <w:tcW w:type="dxa" w:w="1090"/>
+          </w:tcPr>
+          <w:p>
+            <w:pPr>
+              <w:spacing w:after="0" w:line="210" w:lineRule="exact"/>
+              <w:ind w:firstLine="0"/>
+              <w:jc w:val="left"/>
+            </w:pPr>
+            <w:r/>
+            <w:r>
+              <w:rPr>
+                <w:b w:val="0"/>
+                <w:i w:val="0"/>
+                <w:sz w:val="19"/>
+              </w:rPr>
+              <w:t>Nghĩa vụ</w:t>
+            </w:r>
+          </w:p>
+        </w:tc>
+        <w:tc>
+          <w:tcPr>
+            <w:tcW w:type="dxa" w:w="1893"/>
+          </w:tcPr>
+          <w:p>
+            <w:pPr>
+              <w:spacing w:after="0" w:line="210" w:lineRule="exact"/>
+              <w:ind w:firstLine="0"/>
+              <w:jc w:val="left"/>
+            </w:pPr>
+            <w:r/>
+            <w:r>
+              <w:rPr>
+                <w:b w:val="0"/>
+                <w:i w:val="0"/>
+                <w:sz w:val="19"/>
+              </w:rPr>
+              <w:t>Quy định của luật mới</w:t>
+            </w:r>
+          </w:p>
+        </w:tc>
+        <w:tc>
+          <w:tcPr>
+            <w:tcW w:type="dxa" w:w="2065"/>
+          </w:tcPr>
+          <w:p>
+            <w:pPr>
+              <w:spacing w:after="0" w:line="210" w:lineRule="exact"/>
+              <w:ind w:firstLine="0"/>
+              <w:jc w:val="left"/>
+            </w:pPr>
+            <w:r/>
+            <w:r>
+              <w:rPr>
+                <w:b w:val="0"/>
+                <w:i w:val="0"/>
+                <w:sz w:val="19"/>
+              </w:rPr>
+              <w:t>Danh mục số có phân quyền; chỉ công khai dữ liệu được phép</w:t>
             </w:r>
           </w:p>
         </w:tc>
@@ -1552,8 +2300,8 @@
         </w:trPr>
         <w:tc>
           <w:tcPr>
-            <w:tcW w:type="dxa" w:w="2268"/>
-            <w:gridSpan w:val="4"/>
+            <w:tcW w:type="dxa" w:w="2065"/>
+            <w:gridSpan w:val="5"/>
             <w:shd w:val="clear" w:color="auto" w:fill="F2F2F2"/>
           </w:tcPr>
           <w:p>
@@ -1569,7 +2317,7 @@
                 <w:i w:val="0"/>
                 <w:sz w:val="19"/>
               </w:rPr>
-              <w:t>Nhóm 5. Đào tạo và văn hóa</w:t>
+              <w:t>Nhóm 5. Đào tạo và liêm chính</w:t>
             </w:r>
           </w:p>
         </w:tc>
@@ -1580,7 +2328,7 @@
         </w:trPr>
         <w:tc>
           <w:tcPr>
-            <w:tcW w:type="dxa" w:w="2381"/>
+            <w:tcW w:type="dxa" w:w="1951"/>
           </w:tcPr>
           <w:p>
             <w:pPr>
@@ -1601,7 +2349,7 @@
         </w:tc>
         <w:tc>
           <w:tcPr>
-            <w:tcW w:type="dxa" w:w="2835"/>
+            <w:tcW w:type="dxa" w:w="2639"/>
           </w:tcPr>
           <w:p>
             <w:pPr>
@@ -1616,13 +2364,13 @@
                 <w:i w:val="0"/>
                 <w:sz w:val="19"/>
               </w:rPr>
-              <w:t>Chương trình đào tạo sở hữu trí tuệ; nghiên cứu đưa thành nội dung học bắt buộc</w:t>
+              <w:t>Nghiên cứu đưa sở hữu trí tuệ và kỹ năng khai thác thương mại thành nội dung học bắt buộc</w:t>
             </w:r>
           </w:p>
         </w:tc>
         <w:tc>
           <w:tcPr>
-            <w:tcW w:type="dxa" w:w="2154"/>
+            <w:tcW w:type="dxa" w:w="1090"/>
           </w:tcPr>
           <w:p>
             <w:pPr>
@@ -1637,13 +2385,13 @@
                 <w:i w:val="0"/>
                 <w:sz w:val="19"/>
               </w:rPr>
-              <w:t>Định hướng; cơ sở giáo dục đại học</w:t>
+              <w:t>Định hướng</w:t>
             </w:r>
           </w:p>
         </w:tc>
         <w:tc>
           <w:tcPr>
-            <w:tcW w:type="dxa" w:w="2268"/>
+            <w:tcW w:type="dxa" w:w="1893"/>
           </w:tcPr>
           <w:p>
             <w:pPr>
@@ -1658,18 +2406,13 @@
                 <w:i w:val="0"/>
                 <w:sz w:val="19"/>
               </w:rPr>
-              <w:t>Học phần, bồi dưỡng theo vai trò</w:t>
+              <w:t>Sửa đổi: trước chỉ yêu cầu chương trình đào tạo, bồi dưỡng</w:t>
             </w:r>
           </w:p>
         </w:tc>
-      </w:tr>
-      <w:tr>
-        <w:trPr>
-          <w:cantSplit/>
-        </w:trPr>
         <w:tc>
           <w:tcPr>
-            <w:tcW w:type="dxa" w:w="2381"/>
+            <w:tcW w:type="dxa" w:w="2065"/>
           </w:tcPr>
           <w:p>
             <w:pPr>
@@ -1684,13 +2427,18 @@
                 <w:i w:val="0"/>
                 <w:sz w:val="19"/>
               </w:rPr>
-              <w:t>Kết luận số 51-KL/TW, mục 2.2; Luật số 125/2025/QH15, điểm a khoản 3 Điều 28</w:t>
+              <w:t>Học phần; bồi dưỡng theo vai trò</w:t>
             </w:r>
           </w:p>
         </w:tc>
+      </w:tr>
+      <w:tr>
+        <w:trPr>
+          <w:cantSplit/>
+        </w:trPr>
         <w:tc>
           <w:tcPr>
-            <w:tcW w:type="dxa" w:w="2835"/>
+            <w:tcW w:type="dxa" w:w="1951"/>
           </w:tcPr>
           <w:p>
             <w:pPr>
@@ -1705,13 +2453,13 @@
                 <w:i w:val="0"/>
                 <w:sz w:val="19"/>
               </w:rPr>
-              <w:t>Văn hóa tôn trọng sáng tạo; xử lý đạo văn; liêm chính</w:t>
+              <w:t>Luật số 125/2025/QH15, điểm a khoản 3 Điều 28</w:t>
             </w:r>
           </w:p>
         </w:tc>
         <w:tc>
           <w:tcPr>
-            <w:tcW w:type="dxa" w:w="2154"/>
+            <w:tcW w:type="dxa" w:w="2639"/>
           </w:tcPr>
           <w:p>
             <w:pPr>
@@ -1726,13 +2474,55 @@
                 <w:i w:val="0"/>
                 <w:sz w:val="19"/>
               </w:rPr>
-              <w:t>Toàn xã hội; cơ sở giáo dục đại học</w:t>
+              <w:t>Tuân thủ đạo đức, liêm chính trong nghiên cứu</w:t>
             </w:r>
           </w:p>
         </w:tc>
         <w:tc>
           <w:tcPr>
-            <w:tcW w:type="dxa" w:w="2268"/>
+            <w:tcW w:type="dxa" w:w="1090"/>
+          </w:tcPr>
+          <w:p>
+            <w:pPr>
+              <w:spacing w:after="0" w:line="210" w:lineRule="exact"/>
+              <w:ind w:firstLine="0"/>
+              <w:jc w:val="left"/>
+            </w:pPr>
+            <w:r/>
+            <w:r>
+              <w:rPr>
+                <w:b w:val="0"/>
+                <w:i w:val="0"/>
+                <w:sz w:val="19"/>
+              </w:rPr>
+              <w:t>Nghĩa vụ</w:t>
+            </w:r>
+          </w:p>
+        </w:tc>
+        <w:tc>
+          <w:tcPr>
+            <w:tcW w:type="dxa" w:w="1893"/>
+          </w:tcPr>
+          <w:p>
+            <w:pPr>
+              <w:spacing w:after="0" w:line="210" w:lineRule="exact"/>
+              <w:ind w:firstLine="0"/>
+              <w:jc w:val="left"/>
+            </w:pPr>
+            <w:r/>
+            <w:r>
+              <w:rPr>
+                <w:b w:val="0"/>
+                <w:i w:val="0"/>
+                <w:sz w:val="19"/>
+              </w:rPr>
+              <w:t>Quy định của luật mới</w:t>
+            </w:r>
+          </w:p>
+        </w:tc>
+        <w:tc>
+          <w:tcPr>
+            <w:tcW w:type="dxa" w:w="2065"/>
           </w:tcPr>
           <w:p>
             <w:pPr>
@@ -1765,7 +2555,7 @@
           <w:i/>
           <w:sz w:val="19"/>
         </w:rPr>
-        <w:t>Nguồn: Nhóm tác giả tổng hợp từ Bộ Chính trị (2026), Thủ tướng Chính phủ (2019, 2026), Quốc hội (2025a, 2025b) và Văn phòng Quốc hội (2026).</w:t>
+        <w:t>Nguồn: Nhóm tác giả tổng hợp từ Chính phủ (2025), Thủ tướng Chính phủ (2019, 2026), Quốc hội (2025a, 2025b) và Văn phòng Quốc hội (2026). Mức độ thay đổi xác định bằng so sánh với văn bản gốc và chú thích của văn bản hợp nhất.</w:t>
       </w:r>
     </w:p>
     <w:p>
@@ -1791,14 +2581,14 @@
           <w:b/>
           <w:i w:val="0"/>
         </w:rPr>
-        <w:t>Thứ nhất, gắn sở hữu trí tuệ với chiến lược và đánh giá hoạt động.</w:t>
+        <w:t>Thay đổi thực chất tập trung ở quyền và lợi ích.</w:t>
       </w:r>
       <w:r>
         <w:rPr>
           <w:b w:val="0"/>
           <w:i w:val="0"/>
         </w:rPr>
-        <w:t xml:space="preserve"> Đây là định hướng chính sách (Bộ Chính trị, 2026; Thủ tướng Chính phủ, 2026), đòi hỏi mục tiêu sở hữu trí tuệ trong kế hoạch của trường và bộ chỉ số có định nghĩa rõ.</w:t>
+        <w:t xml:space="preserve"> Các dòng mới hoặc sửa đổi ở Nhóm 1 cùng hướng: Nhà nước rút khỏi thủ tục giao quyền, chuyển quyết định khai thác về tổ chức chủ trì, đồng thời đặt mức sàn cho tác giả và yêu cầu ghi nhận đóng góp (Chính phủ, 2025; Quốc hội, 2025a). Hệ quả là trường không còn dựa được vào thủ tục bên ngoài; các quyết định trước đây do cơ quan quản lý nhiệm vụ thực hiện nay phải có chủ thể, trình tự và căn cứ trong quy chế của trường. Cơ chế lợi ích cũng không thể dùng một tỷ lệ chung, vì cùng một trường có tài sản chịu chế độ khác nhau theo nguồn kinh phí, thời điểm giao nhiệm vụ và loại đối tượng.</w:t>
       </w:r>
     </w:p>
     <w:p>
@@ -1812,14 +2602,14 @@
           <w:b/>
           <w:i w:val="0"/>
         </w:rPr>
-        <w:t>Thứ hai, gắn nhận diện, bảo hộ với nghiên cứu và công bố.</w:t>
+        <w:t>Yêu cầu kế thừa nay có thêm công cụ thực hiện.</w:t>
       </w:r>
       <w:r>
         <w:rPr>
           <w:b w:val="0"/>
           <w:i w:val="0"/>
         </w:rPr>
-        <w:t xml:space="preserve"> Chiến lược sửa đổi yêu cầu xác định trước đối tượng quyền cần đạt với kết quả sử dụng ngân sách nhà nước và đăng ký bảo hộ đồng thời với công bố kết quả có tính ứng dụng cao ở khối kỹ thuật, công nghệ (Thủ tướng Chính phủ, 2026). Luật Sở hữu trí tuệ chỉ cho phép nộp đơn sáng chế trong mười hai tháng và đơn kiểu dáng trong sáu tháng kể từ khi người có quyền đăng ký bộc lộ công khai (Văn phòng Quốc hội, 2026). Vì vậy, việc nhận diện phải diễn ra trước công bố.</w:t>
+        <w:t xml:space="preserve"> Dùng chỉ số sở hữu trí tuệ trong đánh giá và đăng ký đồng thời với công bố đã có trong Chiến lược từ năm 2019 (Thủ tướng Chính phủ, 2019). Điểm khác là quyền đăng ký của tổ chức được giao quyền và khoản chi của quỹ cho đăng ký, bảo hộ nay được quy định rõ (Quốc hội, 2025a; Văn phòng Quốc hội, 2026), nên trở ngại còn lại nằm chủ yếu ở cách trường tổ chức quyết định và chi tiền. Thời hạn sau bộc lộ không phải thời hạn nộp đơn chung: khoản 3 Điều 60 và khoản 4 Điều 65 Luật Sở hữu trí tuệ chỉ giữ tính mới khi người có quyền đăng ký, hoặc người có thông tin từ người đó, bộc lộ và đơn được nộp trong 12 tháng đối với sáng chế, 6 tháng đối với kiểu dáng. Vì vậy, nguyên tắc quản lý vẫn là nộp đơn trước khi công bố.</w:t>
       </w:r>
     </w:p>
     <w:p>
@@ -1833,70 +2623,14 @@
           <w:b/>
           <w:i w:val="0"/>
         </w:rPr>
-        <w:t>Thứ ba, nâng cao năng lực hỗ trợ, khai thác.</w:t>
+        <w:t>Quyền mới về tổ chức là lựa chọn, không phải nghĩa vụ.</w:t>
       </w:r>
       <w:r>
         <w:rPr>
           <w:b w:val="0"/>
           <w:i w:val="0"/>
         </w:rPr>
-        <w:t xml:space="preserve"> Chiến lược định hướng phát triển trung tâm chuyển giao, tư vấn, định giá trong cơ sở giáo dục đại học (Thủ tướng Chính phủ, 2019, 2026); Luật Giáo dục đại học trao quyền thành lập doanh nghiệp quản lý tài sản trí tuệ (Quốc hội, 2025b). Đây là quyền, không phải nghĩa vụ phải lập thêm tổ chức.</w:t>
-      </w:r>
-    </w:p>
-    <w:p>
-      <w:pPr>
-        <w:spacing w:before="0" w:after="60"/>
-        <w:ind w:firstLine="340"/>
-        <w:jc w:val="both"/>
-      </w:pPr>
-      <w:r>
-        <w:rPr>
-          <w:b/>
-          <w:i w:val="0"/>
-        </w:rPr>
-        <w:t>Thứ tư, hoàn thiện cơ chế lợi ích, dữ liệu và trách nhiệm giải trình.</w:t>
-      </w:r>
-      <w:r>
-        <w:rPr>
-          <w:b w:val="0"/>
-          <w:i w:val="0"/>
-        </w:rPr>
-        <w:t xml:space="preserve"> Điều 28 Luật số 93/2025/QH15 phân biệt theo nguồn hình thành: với phần không sử dụng ngân sách nhà nước, chủ sở hữu tự quyết định việc xử lý lợi nhuận, kể cả thưởng cho tác giả; với phần sử dụng ngân sách nhà nước, thưởng cho tác giả tối thiểu 30% lợi nhuận sau thuế, hoặc 30% giá trị kết quả khi góp vốn. Điều 73 giữ chế độ cũ cho nhiệm vụ phê duyệt trước ngày 01 tháng 10 năm 2025, trừ lợi nhuận chưa phân chia từ sáng chế, kiểu dáng công nghiệp, thiết kế bố trí, giống cây trồng đã được cấp văn bằng của nhiệm vụ giao từ ngày 01 tháng 01 năm 2023 (Quốc hội, 2025a). Bên cạnh khoản thưởng, chủ sở hữu sáng chế, kiểu dáng, thiết kế bố trí vẫn phải trả thù lao theo Điều 135 Luật Sở hữu trí tuệ, theo thỏa thuận hoặc mức mặc định tính trên số tiền trước thuế (Văn phòng Quốc hội, 2026). Các luật cũng yêu cầu công khai, báo cáo kết quả thương mại hóa và hoạt động khoa học hằng năm (Quốc hội, 2025a, 2025b).</w:t>
-      </w:r>
-    </w:p>
-    <w:p>
-      <w:pPr>
-        <w:spacing w:before="0" w:after="60"/>
-        <w:ind w:firstLine="340"/>
-        <w:jc w:val="both"/>
-      </w:pPr>
-      <w:r>
-        <w:rPr>
-          <w:b/>
-          <w:i w:val="0"/>
-        </w:rPr>
-        <w:t>Thứ năm, phát triển đào tạo và văn hóa sở hữu trí tuệ,</w:t>
-      </w:r>
-      <w:r>
-        <w:rPr>
-          <w:b w:val="0"/>
-          <w:i w:val="0"/>
-        </w:rPr>
-        <w:t xml:space="preserve"> gồm chương trình đào tạo, nghiên cứu đưa sở hữu trí tuệ thành nội dung học bắt buộc, xử lý đạo văn và tuân thủ liêm chính trong nghiên cứu (Bộ Chính trị, 2026; Quốc hội, 2025b; Thủ tướng Chính phủ, 2026).</w:t>
-      </w:r>
-    </w:p>
-    <w:p>
-      <w:pPr>
-        <w:spacing w:before="0" w:after="60"/>
-        <w:ind w:firstLine="340"/>
-        <w:jc w:val="both"/>
-      </w:pPr>
-      <w:r>
-        <w:rPr>
-          <w:b w:val="0"/>
-          <w:i w:val="0"/>
-        </w:rPr>
-        <w:t>Mỗi nhóm yêu cầu không gắn với một cấu phần duy nhất: yêu cầu đăng ký đồng thời với công bố chỉ thực hiện được khi có nghĩa vụ khai báo, bước sàng lọc trước công bố, người chịu trách nhiệm, kinh phí nộp đơn và người nghiên cứu hiểu thời hạn bộc lộ. Đây là cơ sở để thiết kế giải pháp đồng bộ.</w:t>
+        <w:t xml:space="preserve"> Quyền thành lập doanh nghiệp quản lý tài sản trí tuệ và định hướng phát triển trung tâm định giá mở thêm phương án, nhưng không buộc mọi trường lập thêm tổ chức (Quốc hội, 2025b; Thủ tướng Chính phủ, 2026). Ngược lại, nghĩa vụ công khai và mức hưởng mặc định của tổ chức trung gian đòi hỏi trường điều chỉnh ngay cách quản lý dữ liệu và hợp đồng thuê ngoài.</w:t>
       </w:r>
     </w:p>
     <w:p>
@@ -1911,7 +2645,7 @@
           <w:b/>
           <w:i w:val="0"/>
         </w:rPr>
-        <w:t>4.2. Hệ thống giải pháp quản lý sở hữu trí tuệ</w:t>
+        <w:t>4.2. Cơ chế thực hiện qua năm nhóm giải pháp</w:t>
       </w:r>
     </w:p>
     <w:p>
@@ -1925,7 +2659,7 @@
           <w:b w:val="0"/>
           <w:i w:val="0"/>
         </w:rPr>
-        <w:t>Năm nhóm giải pháp dưới đây tương ứng với năm cấu phần quản lý; mỗi nhóm được nối với yêu cầu đã xác định tại Mục 4.1 và trình bày theo mục tiêu, nội dung, chủ thể và điều kiện.</w:t>
+        <w:t>Năm nhóm giải pháp dưới đây tương ứng với năm cấu phần quản lý. Mỗi nhóm nêu các dòng của Bảng 1 mà nó xử lý và quyết định quản lý cần thay đổi.</w:t>
       </w:r>
     </w:p>
     <w:p>
@@ -1940,7 +2674,7 @@
           <w:b/>
           <w:i w:val="0"/>
         </w:rPr>
-        <w:t>4.2.1. Hoàn thiện quy chế và xác định trách nhiệm của các chủ thể</w:t>
+        <w:t>4.2.1. Quy chế xác định chủ thể quyết định và cơ chế lợi ích theo nguồn</w:t>
       </w:r>
     </w:p>
     <w:p>
@@ -1954,7 +2688,7 @@
           <w:b w:val="0"/>
           <w:i w:val="0"/>
         </w:rPr>
-        <w:t>Giải pháp này đáp ứng nhóm yêu cầu thứ tư và tạo căn cứ cho các nhóm còn lại. Quy chế cần bao quát cả đối tượng được bảo hộ theo đăng ký, như sáng chế, kiểu dáng, nhãn hiệu, lẫn đối tượng phát sinh quyền tự động hoặc được bảo vệ bằng biện pháp bảo mật, như giáo trình, phần mềm, cơ sở dữ liệu, bí mật kinh doanh; quy định nghĩa vụ khai báo, bảo mật trước công bố và quyền công bố; quy định quyền của tác giả và của các chủ thể không giữ quyền tài sản, theo hướng Võ (2025) đã nêu; quy định giải quyết tranh chấp nội bộ; và nêu thứ tự áp dụng với quy chế nghiên cứu, quy chế chi tiêu.</w:t>
+        <w:t>Giải pháp này xử lý Nhóm 1 của Bảng 1. Vì quyết định khai thác đã chuyển về tổ chức chủ trì, quy chế cần nêu rõ chủ thể quyết định khai thác, giá, phương án góp vốn và phân chia lợi nhuận; nghĩa vụ khai báo, bảo mật trước công bố và quyền công bố; quyền của tác giả và của các chủ thể không giữ quyền tài sản, theo hướng Võ (2025) đã nêu; và thứ tự áp dụng với quy chế nghiên cứu, quy chế chi tiêu.</w:t>
       </w:r>
     </w:p>
     <w:p>
@@ -1968,7 +2702,7 @@
           <w:b w:val="0"/>
           <w:i w:val="0"/>
         </w:rPr>
-        <w:t>Phân chia lợi ích cần được thiết kế theo nguồn hình thành tài sản, thời điểm giao nhiệm vụ và loại đối tượng. Với phần kết quả sử dụng ngân sách nhà nước thuộc phạm vi Điều 28 Luật số 93/2025/QH15, quy chế không được đặt mức thấp hơn 30% lợi nhuận sau thuế dành cho tác giả; với nhiệm vụ phê duyệt trước ngày 01 tháng 10 năm 2025, cần dẫn chiếu văn bản tại thời điểm phê duyệt, trừ trường hợp tại khoản 7 Điều 73; với tài sản không sử dụng ngân sách nhà nước, trường tự quyết định tỷ lệ (Quốc hội, 2025a). Thù lao theo Điều 135 Luật Sở hữu trí tuệ là khoản riêng, có cơ sở tính khác, nên quy chế cần nêu rõ quy chế hoặc hợp đồng có được coi là thỏa thuận về thù lao hay không (Văn phòng Quốc hội, 2026); nhuận bút cho sách, giáo trình là khoản thứ ba. Tỷ lệ cụ thể nên được mô phỏng trên một số tình huống chuyển giao trước khi ban hành; bài báo không đề xuất một tỷ lệ chung. Chủ trì là bộ phận pháp chế, phối hợp với đơn vị quản lý khoa học và tài chính.</w:t>
+        <w:t>Phân chia lợi ích cần được thiết kế theo nguồn hình thành tài sản, thời điểm giao nhiệm vụ và loại đối tượng. Với phần kết quả từ ngân sách thuộc phạm vi Điều 28 Luật số 93/2025/QH15, quy chế không được đặt mức thấp hơn 30% lợi nhuận sau thuế dành cho tác giả; với nhiệm vụ phê duyệt trước ngày 01 tháng 10 năm 2025, áp dụng văn bản tại thời điểm phê duyệt, trừ trường hợp tại khoản 7 Điều 73; với tài sản không sử dụng ngân sách, trường tự quyết định tỷ lệ (Quốc hội, 2025a). Quy chế cần kèm mẫu văn bản xác định mức đóng góp và mẫu thỏa thuận chia thưởng giữa các đồng tác giả, vì Nghị định số 267/2025/NĐ-CP yêu cầu cả hai (Chính phủ, 2025). Thù lao theo Điều 135 Luật Sở hữu trí tuệ là khoản riêng, có cơ sở tính khác (Văn phòng Quốc hội, 2026); nhuận bút là khoản thứ ba. Nghị định chưa quy định cách xác định lợi nhuận sau thuế của một kết quả hình thành từ nhiều nguồn kinh phí, nên quy chế cần tự nêu phương pháp phân bổ chi phí. Tỷ lệ cụ thể nên được mô phỏng trên một số tình huống chuyển giao trước khi ban hành.</w:t>
       </w:r>
     </w:p>
     <w:p>
@@ -1983,7 +2717,7 @@
           <w:b/>
           <w:i w:val="0"/>
         </w:rPr>
-        <w:t>4.2.2. Tổ chức đầu mối và cơ chế phối hợp</w:t>
+        <w:t>4.2.2. Phân công theo chức năng thay vì mặc định lập bộ máy</w:t>
       </w:r>
     </w:p>
     <w:p>
@@ -1997,7 +2731,7 @@
           <w:b w:val="0"/>
           <w:i w:val="0"/>
         </w:rPr>
-        <w:t>Giải pháp này đáp ứng nhóm yêu cầu thứ ba. Nhóm tác giả đề xuất phân công theo bốn chức năng thay vì mặc định một mô hình: quản lý khoa học, gồm tiếp nhận khai báo và theo dõi danh mục; pháp lý, gồm thẩm định quyền, soạn hồ sơ, làm việc với cơ quan đăng ký; tài chính, gồm dự toán và chi trả; hỗ trợ khai thác và kết nối doanh nghiệp, gồm tìm đối tác, đàm phán, định giá.</w:t>
+        <w:t>Giải pháp này xử lý Nhóm 3 của Bảng 1. Nhóm tác giả đề xuất phân công theo bốn chức năng thay vì mặc định một mô hình: quản lý khoa học, gồm tiếp nhận khai báo và theo dõi danh mục; pháp lý, gồm thẩm định quyền, soạn hồ sơ, làm việc với cơ quan đăng ký; tài chính, gồm dự toán và chi trả; hỗ trợ khai thác, gồm tìm đối tác, đàm phán, định giá.</w:t>
       </w:r>
     </w:p>
     <w:p>
@@ -2011,7 +2745,7 @@
           <w:b w:val="0"/>
           <w:i w:val="0"/>
         </w:rPr>
-        <w:t>Văn phòng chuyên trách chỉ hiệu quả khi lượng sáng chế đủ lớn, và trường chưa đạt quy mô tới hạn có thể hợp tác vùng (Siegel et al., 2007). Vì vậy, trường có ít kết quả có thể bảo hộ nên giao nhiệm vụ kiêm nhiệm cho các phòng hiện có và thuê tổ chức đại diện sở hữu công nghiệp theo hồ sơ; khi số hồ sơ tăng mới xem xét vị trí chuyên trách. Trung tâm tư vấn, định giá hay doanh nghiệp quản lý tài sản trí tuệ chỉ nên đặt ra khi danh mục đã có tài sản sẵn sàng khai thác, có nhu cầu định giá thực tế và có phương án tài chính vận hành. Điều kiện là quy chế phối hợp và báo cáo khối lượng hồ sơ định kỳ.</w:t>
+        <w:t>Theo tổng hợp của Siegel và cộng sự (2007), văn phòng chuyên trách cần đạt quy mô tới hạn mới bù đắp được chi phí cố định; quy mô cần thiết còn tùy chức năng được giao và loại tài sản. Trường có ít kết quả có thể bảo hộ có thể giao nhiệm vụ kiêm nhiệm cho các phòng hiện có và thuê tổ chức đại diện sở hữu công nghiệp theo hồ sơ, xem xét vị trí chuyên trách khi số hồ sơ tăng. Hợp đồng thuê tư vấn, môi giới cần thỏa thuận rõ mức hưởng, vì khi không có thỏa thuận, tổ chức trung gian hưởng tối thiểu 10% lợi nhuận (Chính phủ, 2025). Trung tâm định giá hay doanh nghiệp quản lý tài sản trí tuệ nên được đặt ra khi danh mục đã có tài sản sẵn sàng khai thác và có phương án tài chính vận hành.</w:t>
       </w:r>
     </w:p>
     <w:p>
@@ -2026,7 +2760,7 @@
           <w:b/>
           <w:i w:val="0"/>
         </w:rPr>
-        <w:t>4.2.3. Chuẩn hóa quy trình quản lý tài sản trí tuệ</w:t>
+        <w:t>4.2.3. Quy trình nộp đơn trước công bố, không chờ nghiệm thu</w:t>
       </w:r>
     </w:p>
     <w:p>
@@ -2040,7 +2774,7 @@
           <w:b w:val="0"/>
           <w:i w:val="0"/>
         </w:rPr>
-        <w:t>Giải pháp này đáp ứng nhóm yêu cầu thứ hai. Mục tiêu là mỗi kết quả có khả năng bảo hộ được nhận diện, sàng lọc và xem xét bảo mật trước khi công bố, với cách xử lý phù hợp loại tài sản, theo tám khâu tại Hình 1.</w:t>
+        <w:t>Giải pháp này xử lý Nhóm 2 của Bảng 1. Mục tiêu là kết quả có khả năng bảo hộ được quyết định và nộp đơn trước khi công bố, với cách xử lý phù hợp loại tài sản, theo quy trình tại Hình 1.</w:t>
       </w:r>
     </w:p>
     <w:p>
@@ -2065,7 +2799,7 @@
       <w:r>
         <w:drawing>
           <wp:inline xmlns:a="http://schemas.openxmlformats.org/drawingml/2006/main" xmlns:pic="http://schemas.openxmlformats.org/drawingml/2006/picture">
-            <wp:extent cx="5760000" cy="5053935"/>
+            <wp:extent cx="5760000" cy="5425548"/>
             <wp:docPr id="1" name="Picture 1"/>
             <wp:cNvGraphicFramePr>
               <a:graphicFrameLocks noChangeAspect="1"/>
@@ -2086,7 +2820,7 @@
                   <pic:spPr>
                     <a:xfrm>
                       <a:off x="0" y="0"/>
-                      <a:ext cx="5760000" cy="5053935"/>
+                      <a:ext cx="5760000" cy="5425548"/>
                     </a:xfrm>
                     <a:prstGeom prst="rect"/>
                   </pic:spPr>
@@ -2124,7 +2858,7 @@
           <w:i/>
           <w:sz w:val="19"/>
         </w:rPr>
-        <w:t>Nguồn: Nhóm tác giả đề xuất trên cơ sở Văn phòng Quốc hội (2026) và World Intellectual Property Organization (2020).</w:t>
+        <w:t>Nguồn: Nhóm tác giả đề xuất trên cơ sở Chính phủ (2025), Văn phòng Quốc hội (2026) và World Intellectual Property Organization (2020).</w:t>
       </w:r>
     </w:p>
     <w:p>
@@ -2150,7 +2884,7 @@
           <w:b w:val="0"/>
           <w:i w:val="0"/>
         </w:rPr>
-        <w:t>Khâu 1, người nghiên cứu khai báo đối tượng dự kiến, chủ thể quyền, nguồn kinh phí, lịch công bố, tình trạng bảo mật và nhu cầu hỗ trợ ngay từ thuyết minh. Khâu 2, đầu mối quản lý khoa học sàng lọc và phân nhánh: sáng chế, giải pháp hữu ích cần giữ bí mật đến khi nộp đơn; kiểu dáng cần nộp đơn trước khi trưng bày; nhãn hiệu cần tra cứu trước khi sử dụng; quyền tác giả phát sinh khi tác phẩm được định hình nên chỉ cần ghi nhận và đăng ký khi cần chứng cứ; bí mật kinh doanh được bảo vệ bằng biện pháp bảo mật (Văn phòng Quốc hội, 2026). Khâu 3, tra cứu và đánh giá khả năng bảo hộ; tra cứu sáng chế và phân tích tự do hoạt động còn giúp tránh xâm phạm quyền của bên thứ ba (World Intellectual Property Organization, 2020).</w:t>
+        <w:t>Luồng chính gồm bảy khâu. Khâu 1, người nghiên cứu khai báo đối tượng dự kiến, chủ thể quyền, nguồn kinh phí và lịch công bố ngay từ thuyết minh; từ thời điểm này, thông tin cần bảo vệ được giữ bí mật. Khâu 2, đầu mối quản lý khoa học sàng lọc và phân nhánh theo loại tài sản (Văn phòng Quốc hội, 2026). Khâu 3, tra cứu và đánh giá khả năng bảo hộ; tra cứu sáng chế và phân tích tự do hoạt động còn giúp tránh xâm phạm quyền của bên thứ ba (World Intellectual Property Organization, 2020). Khâu 4, lãnh đạo trường quyết định nộp đơn, giữ bí mật hoặc công bố, đồng thời cấp kinh phí. Khâu 5, nộp đơn hoặc duy trì biện pháp bảo mật. Khâu 6, công bố hoặc trình diễn chỉ sau khi đã có ngày nộp đơn hoặc quyết định không bảo hộ. Khâu 7, khai thác theo Giải pháp 1.</w:t>
       </w:r>
     </w:p>
     <w:p>
@@ -2164,7 +2898,7 @@
           <w:b w:val="0"/>
           <w:i w:val="0"/>
         </w:rPr>
-        <w:t>Khâu 4, trước khi gửi bài báo, báo cáo hội thảo hoặc đưa sản phẩm vào thử nghiệm mở, đầu mối quyết định công bố, trì hoãn, nộp đơn trước hoặc ký cam kết bảo mật, và ghi nhận ngày bộc lộ nếu đã xảy ra. Khâu 5, nghiệm thu là một điểm kiểm tra trong quá trình, không phải thời điểm đầu tiên kết quả được xem xét. Khâu 6 đến Khâu 8 gồm quyết định xác lập quyền kèm dự toán, nộp đơn hoặc áp dụng biện pháp bảo mật, theo dõi, duy trì, và khai thác theo Giải pháp 1. Với kết quả hợp tác doanh nghiệp, thỏa thuận sở hữu trí tuệ cần được xác lập trong giai đoạn gắn kết, như O’Dwyer và cộng sự (2023) mô tả.</w:t>
+        <w:t>Luồng này không chờ nghiệm thu: kết quả cần bảo vệ trong khi đề tài đang thực hiện được chuyển thẳng từ Khâu 3 sang Khâu 4. Nghiệm thu là điểm kiểm tra đặt bên cạnh luồng chính, dùng để đối chiếu khai báo, cập nhật tình trạng quyền, lập văn bản xác định mức đóng góp và đưa kết quả chưa khai báo quay lại Khâu 2. Nếu kết quả đã lỡ bộc lộ, đầu mối ghi ngày bộc lộ và xem xét thời hạn tại khoản 3 Điều 60 hoặc khoản 4 Điều 65 Luật Sở hữu trí tuệ. Với kết quả hợp tác doanh nghiệp, thỏa thuận sở hữu trí tuệ cần được xác lập trong giai đoạn gắn kết, như O’Dwyer và cộng sự (2023) mô tả.</w:t>
       </w:r>
     </w:p>
     <w:p>
@@ -2179,7 +2913,7 @@
           <w:b/>
           <w:i w:val="0"/>
         </w:rPr>
-        <w:t>4.2.4. Bảo đảm kinh phí và thiết kế cơ chế khuyến khích</w:t>
+        <w:t>4.2.4. Nguồn chi cho đơn nộp trong quá trình nghiên cứu</w:t>
       </w:r>
     </w:p>
     <w:p>
@@ -2193,7 +2927,7 @@
           <w:b w:val="0"/>
           <w:i w:val="0"/>
         </w:rPr>
-        <w:t>Giải pháp này đáp ứng nhóm yêu cầu thứ tư về nguồn lực và lợi ích. Mục tiêu là chi phí tra cứu, tư vấn, đăng ký, duy trì và khai thác có nguồn, có người đề xuất chi và có thời hạn. Quỹ phát triển khoa học và công nghệ của tổ chức được chi cho đăng ký, bảo hộ, quản lý, khai thác quyền sở hữu trí tuệ, và cơ sở giáo dục đại học có trách nhiệm thành lập, vận hành quỹ này (Quốc hội, 2025a, 2025b). Trên cơ sở đó, trường có thể lập dòng dự toán riêng cho chi phí xác lập quyền, tính từ số hồ sơ dự kiến và mức phí theo quy định, kèm quy định tạm ứng khi đơn được nộp sau khi đề tài đã quyết toán.</w:t>
+        <w:t>Giải pháp này xử lý Nhóm 4 của Bảng 1. Mục tiêu là chi phí tra cứu, đăng ký, duy trì và khai thác có nguồn, có người đề xuất chi và có thời hạn. Cơ sở giáo dục đại học có nghĩa vụ thành lập quỹ phát triển khoa học và công nghệ, và quỹ được chi cho đăng ký, bảo hộ, quản lý, khai thác quyền sở hữu trí tuệ (Quốc hội, 2025a, 2025b). Trường có thể lập dòng dự toán riêng trong quỹ cho chi phí xác lập quyền, tính từ số hồ sơ dự kiến và mức phí theo quy định. Đơn nộp trong khi đề tài đang thực hiện được chi từ dòng này, không trừ vào kinh phí đề tài, để người nghiên cứu không phải chọn giữa kinh phí nghiên cứu và nộp đơn; quy định tạm ứng áp dụng cho cả đơn nộp trước nghiệm thu và sau khi đề tài đã quyết toán.</w:t>
       </w:r>
     </w:p>
     <w:p>
@@ -2207,7 +2941,7 @@
           <w:b w:val="0"/>
           <w:i w:val="0"/>
         </w:rPr>
-        <w:t>Cơ chế khuyến khích nên ghi nhận đóng góp ở nhiều mốc, như khi đơn được chấp nhận hợp lệ và khi văn bằng được cấp, và cần được cân đối với chế độ dành cho công bố, vì hoạt động thương mại hóa cần được ghi nhận trong hệ thống đánh giá, đãi ngộ (Siegel et al., 2007). Khoản khuyến khích nội bộ này tách biệt với thưởng khi thương mại hóa và thù lao theo luật; lợi ích khi khai thác phân biệt theo nguồn kinh phí và loại giao dịch như chuyển nhượng, chuyển giao quyền sử dụng, tự khai thác, góp vốn. Mức cụ thể phụ thuộc khả năng tài chính của từng trường.</w:t>
+        <w:t>Cơ chế khuyến khích nội bộ có thể ghi nhận đóng góp ở nhiều mốc, như khi đơn được chấp nhận hợp lệ và khi văn bằng được cấp, và cân đối với chế độ dành cho công bố, vì hoạt động thương mại hóa cần được ghi nhận trong hệ thống đánh giá, đãi ngộ (Siegel et al., 2007). Khoản này tách biệt với thưởng khi thương mại hóa và thù lao theo luật; mức cụ thể phụ thuộc khả năng tài chính của từng trường.</w:t>
       </w:r>
     </w:p>
     <w:p>
@@ -2222,7 +2956,7 @@
           <w:b/>
           <w:i w:val="0"/>
         </w:rPr>
-        <w:t>4.2.5. Phát triển năng lực và văn hóa sở hữu trí tuệ</w:t>
+        <w:t>4.2.5. Năng lực và văn hóa sở hữu trí tuệ theo vai trò</w:t>
       </w:r>
     </w:p>
     <w:p>
@@ -2236,7 +2970,7 @@
           <w:b w:val="0"/>
           <w:i w:val="0"/>
         </w:rPr>
-        <w:t>Giải pháp này đáp ứng nhóm yêu cầu thứ năm. Đào tạo nên phân theo vai trò: giảng viên cần kỹ năng nhận diện đối tượng bảo hộ, khai báo và bộc lộ an toàn; người học cần hiểu quyền tác giả, liêm chính và quyền của bên thứ ba; nhân sự quản lý cần kỹ năng tra cứu, sử dụng thông tin sở hữu công nghiệp và hỗ trợ khai thác, vì nhân sự chuyển giao cần kỹ năng thương mại bên cạnh kỹ năng pháp lý (Siegel et al., 2007). Nội dung tra cứu có thể dựa trên hướng dẫn công khai của Tổ chức Sở hữu trí tuệ thế giới (World Intellectual Property Organization, 2020). Cẩm nang ngắn, đầu mối giải đáp và quy định liêm chính được phổ biến giúp văn hóa tôn trọng sáng tạo trở thành chuẩn mực hằng ngày (Bộ Chính trị, 2026); học phần sở hữu trí tuệ có thể được đưa vào chương trình theo lộ trình (Thủ tướng Chính phủ, 2026).</w:t>
+        <w:t>Giải pháp này xử lý Nhóm 5 của Bảng 1. Đào tạo nên phân theo vai trò: giảng viên cần kỹ năng nhận diện đối tượng bảo hộ, khai báo và bộc lộ an toàn; người học cần hiểu quyền tác giả, liêm chính và quyền của bên thứ ba; nhân sự quản lý cần kỹ năng tra cứu và hỗ trợ khai thác, vì nhân sự chuyển giao cần kỹ năng thương mại bên cạnh kỹ năng pháp lý (Siegel et al., 2007). Nội dung tra cứu có thể dựa trên hướng dẫn công khai của Tổ chức Sở hữu trí tuệ thế giới (World Intellectual Property Organization, 2020). Học phần sở hữu trí tuệ và kỹ năng khai thác thương mại có thể được đưa vào chương trình theo lộ trình (Thủ tướng Chính phủ, 2026); quy định liêm chính được phổ biến cùng cẩm nang ngắn và đầu mối giải đáp (Bộ Chính trị, 2026).</w:t>
       </w:r>
     </w:p>
     <w:p>
@@ -2251,7 +2985,7 @@
           <w:b/>
           <w:i w:val="0"/>
         </w:rPr>
-        <w:t>4.3. Điều kiện triển khai và chỉ số theo dõi</w:t>
+        <w:t>4.3. Lộ trình triển khai và chỉ số có định nghĩa</w:t>
       </w:r>
     </w:p>
     <w:p>
@@ -2265,21 +2999,7 @@
           <w:b w:val="0"/>
           <w:i w:val="0"/>
         </w:rPr>
-        <w:t>Hệ thống giải pháp nên được triển khai theo ba bước. Bước rà soát và chuẩn bị gồm đối chiếu quy chế hiện hành với Bảng 1, giao đầu mối và hoàn thiện biểu mẫu khai báo. Bước triển khai có lựa chọn áp dụng quy trình cho một đơn vị hoặc một nhóm đề tài có nhiều kết quả có khả năng bảo hộ, đo thời gian và khó khăn phát sinh. Bước đánh giá và hoàn thiện điều chỉnh quy chế, biểu mẫu, dự toán theo kết quả đo trước khi áp dụng toàn trường.</w:t>
-      </w:r>
-    </w:p>
-    <w:p>
-      <w:pPr>
-        <w:spacing w:before="0" w:after="60"/>
-        <w:ind w:firstLine="340"/>
-        <w:jc w:val="both"/>
-      </w:pPr>
-      <w:r>
-        <w:rPr>
-          <w:b w:val="0"/>
-          <w:i w:val="0"/>
-        </w:rPr>
-        <w:t>Bảng 2 tổng hợp điều kiện thực hiện và chỉ số theo dõi. Chỉ số được chia thành ba loại: chỉ số hoạt động phản ánh việc quy trình có được vận hành; chỉ số đầu ra phản ánh đơn và văn bằng; chỉ số kết quả khai thác phản ánh hợp đồng, nguồn thu và lợi ích được chi trả. Cách phân loại này phù hợp với khuyến nghị thống nhất định nghĩa, chỉ số cho các kênh khai thác tri thức (Council of the European Union, 2022). Bài báo không đặt mức đích chung, vì mức đích phụ thuộc quy mô nghiên cứu và lĩnh vực của từng trường.</w:t>
+        <w:t>Hệ thống giải pháp nên được triển khai theo ba bước: rà soát quy chế hiện hành theo Bảng 1 và giao đầu mối; áp dụng quy trình cho một đơn vị hoặc một nhóm đề tài có nhiều kết quả có khả năng bảo hộ; đánh giá, điều chỉnh rồi áp dụng toàn trường. Bảng 2 chỉ giữ những chỉ số định nghĩa được tử số, mẫu số và nguồn dữ liệu, phân thành chỉ số hoạt động, đầu ra và kết quả khai thác, phù hợp khuyến nghị thống nhất định nghĩa, chỉ số cho các kênh khai thác tri thức (Council of the European Union, 2022). Bài báo không đặt mức đích chung, vì mức đích phụ thuộc quy mô nghiên cứu và lĩnh vực của từng trường.</w:t>
       </w:r>
     </w:p>
     <w:p>
@@ -2306,7 +3026,7 @@
           <w:b/>
           <w:i w:val="0"/>
         </w:rPr>
-        <w:t>Bảng 2. Điều kiện triển khai và chỉ số theo dõi hệ thống giải pháp</w:t>
+        <w:t>Bảng 2. Chỉ số theo dõi, định nghĩa và nguồn dữ liệu</w:t>
       </w:r>
     </w:p>
     <w:tbl>
@@ -2329,51 +3049,7 @@
         </w:trPr>
         <w:tc>
           <w:tcPr>
-            <w:tcW w:type="dxa" w:w="1814"/>
-            <w:shd w:val="clear" w:color="auto" w:fill="DCE8F7"/>
-          </w:tcPr>
-          <w:p>
-            <w:pPr>
-              <w:spacing w:after="0" w:line="210" w:lineRule="exact"/>
-              <w:ind w:firstLine="0"/>
-              <w:jc w:val="center"/>
-            </w:pPr>
-            <w:r/>
-            <w:r>
-              <w:rPr>
-                <w:b/>
-                <w:i w:val="0"/>
-                <w:sz w:val="19"/>
-              </w:rPr>
-              <w:t>Nhóm giải pháp</w:t>
-            </w:r>
-          </w:p>
-        </w:tc>
-        <w:tc>
-          <w:tcPr>
-            <w:tcW w:type="dxa" w:w="2494"/>
-            <w:shd w:val="clear" w:color="auto" w:fill="DCE8F7"/>
-          </w:tcPr>
-          <w:p>
-            <w:pPr>
-              <w:spacing w:after="0" w:line="210" w:lineRule="exact"/>
-              <w:ind w:firstLine="0"/>
-              <w:jc w:val="center"/>
-            </w:pPr>
-            <w:r/>
-            <w:r>
-              <w:rPr>
-                <w:b/>
-                <w:i w:val="0"/>
-                <w:sz w:val="19"/>
-              </w:rPr>
-              <w:t>Điều kiện thực hiện</w:t>
-            </w:r>
-          </w:p>
-        </w:tc>
-        <w:tc>
-          <w:tcPr>
-            <w:tcW w:type="dxa" w:w="3402"/>
+            <w:tcW w:type="dxa" w:w="2041"/>
             <w:shd w:val="clear" w:color="auto" w:fill="DCE8F7"/>
           </w:tcPr>
           <w:p>
@@ -2395,6 +3071,50 @@
         </w:tc>
         <w:tc>
           <w:tcPr>
+            <w:tcW w:type="dxa" w:w="4309"/>
+            <w:shd w:val="clear" w:color="auto" w:fill="DCE8F7"/>
+          </w:tcPr>
+          <w:p>
+            <w:pPr>
+              <w:spacing w:after="0" w:line="210" w:lineRule="exact"/>
+              <w:ind w:firstLine="0"/>
+              <w:jc w:val="center"/>
+            </w:pPr>
+            <w:r/>
+            <w:r>
+              <w:rPr>
+                <w:b/>
+                <w:i w:val="0"/>
+                <w:sz w:val="19"/>
+              </w:rPr>
+              <w:t>Định nghĩa, cách tính</w:t>
+            </w:r>
+          </w:p>
+        </w:tc>
+        <w:tc>
+          <w:tcPr>
+            <w:tcW w:type="dxa" w:w="1361"/>
+            <w:shd w:val="clear" w:color="auto" w:fill="DCE8F7"/>
+          </w:tcPr>
+          <w:p>
+            <w:pPr>
+              <w:spacing w:after="0" w:line="210" w:lineRule="exact"/>
+              <w:ind w:firstLine="0"/>
+              <w:jc w:val="center"/>
+            </w:pPr>
+            <w:r/>
+            <w:r>
+              <w:rPr>
+                <w:b/>
+                <w:i w:val="0"/>
+                <w:sz w:val="19"/>
+              </w:rPr>
+              <w:t>Loại; giải pháp</w:t>
+            </w:r>
+          </w:p>
+        </w:tc>
+        <w:tc>
+          <w:tcPr>
             <w:tcW w:type="dxa" w:w="1928"/>
             <w:shd w:val="clear" w:color="auto" w:fill="DCE8F7"/>
           </w:tcPr>
@@ -2411,7 +3131,7 @@
                 <w:i w:val="0"/>
                 <w:sz w:val="19"/>
               </w:rPr>
-              <w:t>Nguồn minh chứng</w:t>
+              <w:t>Nguồn dữ liệu</w:t>
             </w:r>
           </w:p>
         </w:tc>
@@ -2422,7 +3142,7 @@
         </w:trPr>
         <w:tc>
           <w:tcPr>
-            <w:tcW w:type="dxa" w:w="1814"/>
+            <w:tcW w:type="dxa" w:w="2041"/>
           </w:tcPr>
           <w:p>
             <w:pPr>
@@ -2437,13 +3157,13 @@
                 <w:i w:val="0"/>
                 <w:sz w:val="19"/>
               </w:rPr>
-              <w:t>1. Quy chế và trách nhiệm</w:t>
+              <w:t>1. Tỷ lệ kết quả khai báo trước công bố</w:t>
             </w:r>
           </w:p>
         </w:tc>
         <w:tc>
           <w:tcPr>
-            <w:tcW w:type="dxa" w:w="2494"/>
+            <w:tcW w:type="dxa" w:w="4309"/>
           </w:tcPr>
           <w:p>
             <w:pPr>
@@ -2458,13 +3178,13 @@
                 <w:i w:val="0"/>
                 <w:sz w:val="19"/>
               </w:rPr>
-              <w:t>Rà soát văn bản nội bộ; đối chiếu pháp luật; tham vấn giảng viên</w:t>
+              <w:t>Tử số: kết quả thuộc nhánh sáng chế, giải pháp hữu ích, kiểu dáng có phiếu khai báo ghi ngày trước lần công bố đầu tiên. Mẫu số: kết quả thuộc các nhánh này nêu trong báo cáo tổng kết của đề tài nghiệm thu trong năm</w:t>
             </w:r>
           </w:p>
         </w:tc>
         <w:tc>
           <w:tcPr>
-            <w:tcW w:type="dxa" w:w="3402"/>
+            <w:tcW w:type="dxa" w:w="1361"/>
           </w:tcPr>
           <w:p>
             <w:pPr>
@@ -2475,19 +3195,11 @@
             <w:r/>
             <w:r>
               <w:rPr>
-                <w:b/>
-                <w:i w:val="0"/>
-                <w:sz w:val="19"/>
-              </w:rPr>
-              <w:t>Hoạt động:</w:t>
-            </w:r>
-            <w:r>
-              <w:rPr>
                 <w:b w:val="0"/>
                 <w:i w:val="0"/>
                 <w:sz w:val="19"/>
               </w:rPr>
-              <w:t xml:space="preserve"> quy chế sửa đổi được ban hành; tỷ lệ tình huống chuyển giao xác định được quy định áp dụng</w:t>
+              <w:t>Hoạt động; 3</w:t>
             </w:r>
           </w:p>
         </w:tc>
@@ -2508,7 +3220,7 @@
                 <w:i w:val="0"/>
                 <w:sz w:val="19"/>
               </w:rPr>
-              <w:t>Quyết định ban hành; bảng thứ tự áp dụng</w:t>
+              <w:t>Phiếu khai báo; báo cáo tổng kết; danh mục công bố</w:t>
             </w:r>
           </w:p>
         </w:tc>
@@ -2519,7 +3231,7 @@
         </w:trPr>
         <w:tc>
           <w:tcPr>
-            <w:tcW w:type="dxa" w:w="1814"/>
+            <w:tcW w:type="dxa" w:w="2041"/>
           </w:tcPr>
           <w:p>
             <w:pPr>
@@ -2534,13 +3246,13 @@
                 <w:i w:val="0"/>
                 <w:sz w:val="19"/>
               </w:rPr>
-              <w:t>2. Đầu mối và phối hợp</w:t>
+              <w:t>2. Thời gian xử lý</w:t>
             </w:r>
           </w:p>
         </w:tc>
         <w:tc>
           <w:tcPr>
-            <w:tcW w:type="dxa" w:w="2494"/>
+            <w:tcW w:type="dxa" w:w="4309"/>
           </w:tcPr>
           <w:p>
             <w:pPr>
@@ -2555,13 +3267,13 @@
                 <w:i w:val="0"/>
                 <w:sz w:val="19"/>
               </w:rPr>
-              <w:t>Phân công bốn chức năng; quy chế phối hợp; năng lực nhân sự hoặc dịch vụ thuê ngoài</w:t>
+              <w:t>Số ngày làm việc từ ngày nhận phiếu khai báo đầy đủ đến ngày có quyết định tại Khâu 4, trừ thời gian chờ người nghiên cứu bổ sung; báo cáo trung vị, tách đơn nộp trước và sau nghiệm thu</w:t>
             </w:r>
           </w:p>
         </w:tc>
         <w:tc>
           <w:tcPr>
-            <w:tcW w:type="dxa" w:w="3402"/>
+            <w:tcW w:type="dxa" w:w="1361"/>
           </w:tcPr>
           <w:p>
             <w:pPr>
@@ -2572,19 +3284,11 @@
             <w:r/>
             <w:r>
               <w:rPr>
-                <w:b/>
-                <w:i w:val="0"/>
-                <w:sz w:val="19"/>
-              </w:rPr>
-              <w:t>Hoạt động:</w:t>
-            </w:r>
-            <w:r>
-              <w:rPr>
                 <w:b w:val="0"/>
                 <w:i w:val="0"/>
                 <w:sz w:val="19"/>
               </w:rPr>
-              <w:t xml:space="preserve"> thời gian xử lý trung bình từ khai báo đến quyết định; số hồ sơ do mỗi đầu mối xử lý</w:t>
+              <w:t>Hoạt động; 2, 3</w:t>
             </w:r>
           </w:p>
         </w:tc>
@@ -2605,7 +3309,7 @@
                 <w:i w:val="0"/>
                 <w:sz w:val="19"/>
               </w:rPr>
-              <w:t>Sổ theo dõi hồ sơ; biên bản giao ban</w:t>
+              <w:t>Sổ theo dõi hồ sơ</w:t>
             </w:r>
           </w:p>
         </w:tc>
@@ -2616,7 +3320,7 @@
         </w:trPr>
         <w:tc>
           <w:tcPr>
-            <w:tcW w:type="dxa" w:w="1814"/>
+            <w:tcW w:type="dxa" w:w="2041"/>
           </w:tcPr>
           <w:p>
             <w:pPr>
@@ -2631,13 +3335,13 @@
                 <w:i w:val="0"/>
                 <w:sz w:val="19"/>
               </w:rPr>
-              <w:t>3. Quy trình</w:t>
+              <w:t>3. Tỷ lệ hồ sơ được tạm ứng đúng hạn</w:t>
             </w:r>
           </w:p>
         </w:tc>
         <w:tc>
           <w:tcPr>
-            <w:tcW w:type="dxa" w:w="2494"/>
+            <w:tcW w:type="dxa" w:w="4309"/>
           </w:tcPr>
           <w:p>
             <w:pPr>
@@ -2652,13 +3356,13 @@
                 <w:i w:val="0"/>
                 <w:sz w:val="19"/>
               </w:rPr>
-              <w:t>Phiếu khai báo, phiếu sàng lọc; công cụ tra cứu; danh mục số theo trạng thái pháp lý</w:t>
+              <w:t>Tử số: hồ sơ được tạm ứng phí trước hạn nộp đơn ghi trong quyết định. Mẫu số: hồ sơ có quyết định nộp đơn trong năm</w:t>
             </w:r>
           </w:p>
         </w:tc>
         <w:tc>
           <w:tcPr>
-            <w:tcW w:type="dxa" w:w="3402"/>
+            <w:tcW w:type="dxa" w:w="1361"/>
           </w:tcPr>
           <w:p>
             <w:pPr>
@@ -2669,35 +3373,11 @@
             <w:r/>
             <w:r>
               <w:rPr>
-                <w:b/>
-                <w:i w:val="0"/>
-                <w:sz w:val="19"/>
-              </w:rPr>
-              <w:t>Hoạt động:</w:t>
-            </w:r>
-            <w:r>
-              <w:rPr>
                 <w:b w:val="0"/>
                 <w:i w:val="0"/>
                 <w:sz w:val="19"/>
               </w:rPr>
-              <w:t xml:space="preserve"> tỷ lệ kết quả được khai báo và sàng lọc trước công bố; tỷ lệ đề tài nghiệm thu có phiếu xác nhận. </w:t>
-            </w:r>
-            <w:r>
-              <w:rPr>
-                <w:b/>
-                <w:i w:val="0"/>
-                <w:sz w:val="19"/>
-              </w:rPr>
-              <w:t>Đầu ra:</w:t>
-            </w:r>
-            <w:r>
-              <w:rPr>
-                <w:b w:val="0"/>
-                <w:i w:val="0"/>
-                <w:sz w:val="19"/>
-              </w:rPr>
-              <w:t xml:space="preserve"> số đơn theo loại đối tượng</w:t>
+              <w:t>Hoạt động; 4</w:t>
             </w:r>
           </w:p>
         </w:tc>
@@ -2718,7 +3398,7 @@
                 <w:i w:val="0"/>
                 <w:sz w:val="19"/>
               </w:rPr>
-              <w:t>Phiếu khai báo; danh mục số; thông báo của cơ quan đăng ký</w:t>
+              <w:t>Quyết định; chứng từ tạm ứng</w:t>
             </w:r>
           </w:p>
         </w:tc>
@@ -2729,7 +3409,7 @@
         </w:trPr>
         <w:tc>
           <w:tcPr>
-            <w:tcW w:type="dxa" w:w="1814"/>
+            <w:tcW w:type="dxa" w:w="2041"/>
           </w:tcPr>
           <w:p>
             <w:pPr>
@@ -2744,13 +3424,13 @@
                 <w:i w:val="0"/>
                 <w:sz w:val="19"/>
               </w:rPr>
-              <w:t>4. Kinh phí và khuyến khích</w:t>
+              <w:t>4. Tỷ lệ đơn nộp trước công bố</w:t>
             </w:r>
           </w:p>
         </w:tc>
         <w:tc>
           <w:tcPr>
-            <w:tcW w:type="dxa" w:w="2494"/>
+            <w:tcW w:type="dxa" w:w="4309"/>
           </w:tcPr>
           <w:p>
             <w:pPr>
@@ -2765,13 +3445,13 @@
                 <w:i w:val="0"/>
                 <w:sz w:val="19"/>
               </w:rPr>
-              <w:t>Dòng dự toán cho xác lập quyền; quy định tạm ứng; cơ chế lợi ích theo nguồn kinh phí</w:t>
+              <w:t>Tử số: đơn sáng chế, giải pháp hữu ích, kiểu dáng có ngày nộp đơn trước ngày bộc lộ đầu tiên. Mẫu số: đơn các loại này nộp trong năm</w:t>
             </w:r>
           </w:p>
         </w:tc>
         <w:tc>
           <w:tcPr>
-            <w:tcW w:type="dxa" w:w="3402"/>
+            <w:tcW w:type="dxa" w:w="1361"/>
           </w:tcPr>
           <w:p>
             <w:pPr>
@@ -2782,35 +3462,11 @@
             <w:r/>
             <w:r>
               <w:rPr>
-                <w:b/>
-                <w:i w:val="0"/>
-                <w:sz w:val="19"/>
-              </w:rPr>
-              <w:t>Đầu ra:</w:t>
-            </w:r>
-            <w:r>
-              <w:rPr>
                 <w:b w:val="0"/>
                 <w:i w:val="0"/>
                 <w:sz w:val="19"/>
               </w:rPr>
-              <w:t xml:space="preserve"> số văn bằng, giấy chứng nhận được cấp, tách theo nguồn hình thành. </w:t>
-            </w:r>
-            <w:r>
-              <w:rPr>
-                <w:b/>
-                <w:i w:val="0"/>
-                <w:sz w:val="19"/>
-              </w:rPr>
-              <w:t>Kết quả khai thác:</w:t>
-            </w:r>
-            <w:r>
-              <w:rPr>
-                <w:b w:val="0"/>
-                <w:i w:val="0"/>
-                <w:sz w:val="19"/>
-              </w:rPr>
-              <w:t xml:space="preserve"> số hợp đồng; nguồn thu; khoản chi trả cho tác giả tách theo thưởng, thù lao, nhuận bút</w:t>
+              <w:t>Đầu ra; 3, 4</w:t>
             </w:r>
           </w:p>
         </w:tc>
@@ -2831,7 +3487,7 @@
                 <w:i w:val="0"/>
                 <w:sz w:val="19"/>
               </w:rPr>
-              <w:t>Văn bằng; hợp đồng; sổ kế toán</w:t>
+              <w:t>Tờ khai; danh mục công bố</w:t>
             </w:r>
           </w:p>
         </w:tc>
@@ -2842,7 +3498,7 @@
         </w:trPr>
         <w:tc>
           <w:tcPr>
-            <w:tcW w:type="dxa" w:w="1814"/>
+            <w:tcW w:type="dxa" w:w="2041"/>
           </w:tcPr>
           <w:p>
             <w:pPr>
@@ -2857,13 +3513,13 @@
                 <w:i w:val="0"/>
                 <w:sz w:val="19"/>
               </w:rPr>
-              <w:t>5. Năng lực và văn hóa</w:t>
+              <w:t>5. Tỷ lệ người được bồi dưỡng theo vai trò</w:t>
             </w:r>
           </w:p>
         </w:tc>
         <w:tc>
           <w:tcPr>
-            <w:tcW w:type="dxa" w:w="2494"/>
+            <w:tcW w:type="dxa" w:w="4309"/>
           </w:tcPr>
           <w:p>
             <w:pPr>
@@ -2878,13 +3534,13 @@
                 <w:i w:val="0"/>
                 <w:sz w:val="19"/>
               </w:rPr>
-              <w:t>Chương trình đào tạo theo vai trò; cẩm nang; đầu mối giải đáp</w:t>
+              <w:t>Tử số: chủ nhiệm đề tài mới và nhân sự đầu mối hoàn thành bồi dưỡng. Mẫu số: số người thuộc hai nhóm này trong năm</w:t>
             </w:r>
           </w:p>
         </w:tc>
         <w:tc>
           <w:tcPr>
-            <w:tcW w:type="dxa" w:w="3402"/>
+            <w:tcW w:type="dxa" w:w="1361"/>
           </w:tcPr>
           <w:p>
             <w:pPr>
@@ -2895,19 +3551,11 @@
             <w:r/>
             <w:r>
               <w:rPr>
-                <w:b/>
-                <w:i w:val="0"/>
-                <w:sz w:val="19"/>
-              </w:rPr>
-              <w:t>Hoạt động:</w:t>
-            </w:r>
-            <w:r>
-              <w:rPr>
                 <w:b w:val="0"/>
                 <w:i w:val="0"/>
                 <w:sz w:val="19"/>
               </w:rPr>
-              <w:t xml:space="preserve"> số lượt bồi dưỡng theo nhóm đối tượng; tỷ lệ nhân sự mới được bồi dưỡng</w:t>
+              <w:t>Hoạt động; 5</w:t>
             </w:r>
           </w:p>
         </w:tc>
@@ -2928,7 +3576,185 @@
                 <w:i w:val="0"/>
                 <w:sz w:val="19"/>
               </w:rPr>
-              <w:t>Danh sách tập huấn; đề cương học phần</w:t>
+              <w:t>Danh sách bồi dưỡng</w:t>
+            </w:r>
+          </w:p>
+        </w:tc>
+      </w:tr>
+      <w:tr>
+        <w:trPr>
+          <w:cantSplit/>
+        </w:trPr>
+        <w:tc>
+          <w:tcPr>
+            <w:tcW w:type="dxa" w:w="2041"/>
+          </w:tcPr>
+          <w:p>
+            <w:pPr>
+              <w:spacing w:after="0" w:line="210" w:lineRule="exact"/>
+              <w:ind w:firstLine="0"/>
+              <w:jc w:val="left"/>
+            </w:pPr>
+            <w:r/>
+            <w:r>
+              <w:rPr>
+                <w:b w:val="0"/>
+                <w:i w:val="0"/>
+                <w:sz w:val="19"/>
+              </w:rPr>
+              <w:t>6. Hợp đồng và nguồn thu</w:t>
+            </w:r>
+          </w:p>
+        </w:tc>
+        <w:tc>
+          <w:tcPr>
+            <w:tcW w:type="dxa" w:w="4309"/>
+          </w:tcPr>
+          <w:p>
+            <w:pPr>
+              <w:spacing w:after="0" w:line="210" w:lineRule="exact"/>
+              <w:ind w:firstLine="0"/>
+              <w:jc w:val="left"/>
+            </w:pPr>
+            <w:r/>
+            <w:r>
+              <w:rPr>
+                <w:b w:val="0"/>
+                <w:i w:val="0"/>
+                <w:sz w:val="19"/>
+              </w:rPr>
+              <w:t>Hợp đồng chuyển nhượng hoặc chuyển quyền sử dụng đã ký trong năm; nguồn thu là tiền thực thu trong năm, ghi riêng giá trị ký kết</w:t>
+            </w:r>
+          </w:p>
+        </w:tc>
+        <w:tc>
+          <w:tcPr>
+            <w:tcW w:type="dxa" w:w="1361"/>
+          </w:tcPr>
+          <w:p>
+            <w:pPr>
+              <w:spacing w:after="0" w:line="210" w:lineRule="exact"/>
+              <w:ind w:firstLine="0"/>
+              <w:jc w:val="left"/>
+            </w:pPr>
+            <w:r/>
+            <w:r>
+              <w:rPr>
+                <w:b w:val="0"/>
+                <w:i w:val="0"/>
+                <w:sz w:val="19"/>
+              </w:rPr>
+              <w:t>Kết quả khai thác; 1, 2</w:t>
+            </w:r>
+          </w:p>
+        </w:tc>
+        <w:tc>
+          <w:tcPr>
+            <w:tcW w:type="dxa" w:w="1928"/>
+          </w:tcPr>
+          <w:p>
+            <w:pPr>
+              <w:spacing w:after="0" w:line="210" w:lineRule="exact"/>
+              <w:ind w:firstLine="0"/>
+              <w:jc w:val="left"/>
+            </w:pPr>
+            <w:r/>
+            <w:r>
+              <w:rPr>
+                <w:b w:val="0"/>
+                <w:i w:val="0"/>
+                <w:sz w:val="19"/>
+              </w:rPr>
+              <w:t>Hợp đồng; sổ kế toán</w:t>
+            </w:r>
+          </w:p>
+        </w:tc>
+      </w:tr>
+      <w:tr>
+        <w:trPr>
+          <w:cantSplit/>
+        </w:trPr>
+        <w:tc>
+          <w:tcPr>
+            <w:tcW w:type="dxa" w:w="2041"/>
+          </w:tcPr>
+          <w:p>
+            <w:pPr>
+              <w:spacing w:after="0" w:line="210" w:lineRule="exact"/>
+              <w:ind w:firstLine="0"/>
+              <w:jc w:val="left"/>
+            </w:pPr>
+            <w:r/>
+            <w:r>
+              <w:rPr>
+                <w:b w:val="0"/>
+                <w:i w:val="0"/>
+                <w:sz w:val="19"/>
+              </w:rPr>
+              <w:t>7. Khoản chi trả cho tác giả</w:t>
+            </w:r>
+          </w:p>
+        </w:tc>
+        <w:tc>
+          <w:tcPr>
+            <w:tcW w:type="dxa" w:w="4309"/>
+          </w:tcPr>
+          <w:p>
+            <w:pPr>
+              <w:spacing w:after="0" w:line="210" w:lineRule="exact"/>
+              <w:ind w:firstLine="0"/>
+              <w:jc w:val="left"/>
+            </w:pPr>
+            <w:r/>
+            <w:r>
+              <w:rPr>
+                <w:b w:val="0"/>
+                <w:i w:val="0"/>
+                <w:sz w:val="19"/>
+              </w:rPr>
+              <w:t>Số tiền thực chi trong năm, tách thưởng, thù lao, nhuận bút</w:t>
+            </w:r>
+          </w:p>
+        </w:tc>
+        <w:tc>
+          <w:tcPr>
+            <w:tcW w:type="dxa" w:w="1361"/>
+          </w:tcPr>
+          <w:p>
+            <w:pPr>
+              <w:spacing w:after="0" w:line="210" w:lineRule="exact"/>
+              <w:ind w:firstLine="0"/>
+              <w:jc w:val="left"/>
+            </w:pPr>
+            <w:r/>
+            <w:r>
+              <w:rPr>
+                <w:b w:val="0"/>
+                <w:i w:val="0"/>
+                <w:sz w:val="19"/>
+              </w:rPr>
+              <w:t>Kết quả khai thác; 1</w:t>
+            </w:r>
+          </w:p>
+        </w:tc>
+        <w:tc>
+          <w:tcPr>
+            <w:tcW w:type="dxa" w:w="1928"/>
+          </w:tcPr>
+          <w:p>
+            <w:pPr>
+              <w:spacing w:after="0" w:line="210" w:lineRule="exact"/>
+              <w:ind w:firstLine="0"/>
+              <w:jc w:val="left"/>
+            </w:pPr>
+            <w:r/>
+            <w:r>
+              <w:rPr>
+                <w:b w:val="0"/>
+                <w:i w:val="0"/>
+                <w:sz w:val="19"/>
+              </w:rPr>
+              <w:t>Sổ kế toán</w:t>
             </w:r>
           </w:p>
         </w:tc>
@@ -2972,7 +3798,7 @@
           <w:b w:val="0"/>
           <w:i w:val="0"/>
         </w:rPr>
-        <w:t>Do văn bằng chỉ được cấp sau các giai đoạn thẩm định, chỉ số đầu ra và kết quả khai thác phản ánh tác động chậm hơn chỉ số hoạt động; vì vậy, năm đầu triển khai nên được đánh giá chủ yếu bằng chỉ số hoạt động.</w:t>
+        <w:t>Số văn bằng được cấp không được gán cho riêng một giải pháp: đây là đầu ra chịu tác động của nhiều cấu phần và có độ trễ do các giai đoạn thẩm định, nên chỉ được theo dõi như đầu ra chung của hệ thống. Năm đầu triển khai nên được đánh giá chủ yếu bằng chỉ số hoạt động.</w:t>
       </w:r>
     </w:p>
     <w:p>
@@ -3001,7 +3827,7 @@
           <w:b w:val="0"/>
           <w:i w:val="0"/>
         </w:rPr>
-        <w:t>Kết quả phân tích cho thấy năm nhóm giải pháp phụ thuộc lẫn nhau. Quy trình sàng lọc trước công bố chỉ có hiệu lực khi quy chế đặt nghĩa vụ khai báo và bảo mật; nghĩa vụ đó chỉ được thực hiện khi có đầu mối tiếp nhận trong thời hạn hợp lý; quyết định nộp đơn chỉ thành hiện thực khi có dự toán và người đề xuất chi; còn người nghiên cứu chỉ khai báo khi hiểu thời hạn bộc lộ và thấy đóng góp của mình được ghi nhận. Vì vậy, chỉ bổ sung biểu mẫu khó đáp ứng yêu cầu đăng ký đồng thời với công bố. Nhận định này phù hợp với kết luận của Siegel và cộng sự (2007) rằng thương mại hóa đòi hỏi một chiến lược nhất quán thay vì các biện pháp đơn lẻ.</w:t>
+        <w:t>Kết quả gợi ý năm nhóm giải pháp phụ thuộc lẫn nhau. Quy trình sàng lọc khó vận hành nếu quy chế chưa đặt nghĩa vụ khai báo và bảo mật, nếu đầu mối không tiếp nhận trong thời hạn hợp lý, hoặc nếu quyết định nộp đơn không đi kèm nguồn chi. Bài báo giả định rằng người nghiên cứu sẽ khai báo nhiều hơn khi hiểu điều kiện giữ tính mới và thấy đóng góp được ghi nhận; giả định hành vi này chưa được kiểm chứng trong nghiên cứu.</w:t>
       </w:r>
     </w:p>
     <w:p>
@@ -3015,7 +3841,7 @@
           <w:b w:val="0"/>
           <w:i w:val="0"/>
         </w:rPr>
-        <w:t>Đối chiếu với các nghiên cứu đã tổng quan, hệ thống đề xuất kế thừa ba điểm. Thứ nhất, việc đặt khai báo làm đầu vào của quy trình dựa trên nhận định rằng bản khai báo là đầu vào then chốt của chuyển giao (Siegel et al., 2007). Thứ hai, việc đưa tra cứu sáng chế và phân tích tự do hoạt động vào quy trình và chương trình đào tạo dựa trên hướng dẫn của Tổ chức Sở hữu trí tuệ thế giới (World Intellectual Property Organization, 2020). Thứ ba, việc xác lập thỏa thuận sở hữu trí tuệ trong giai đoạn gắn kết của hợp tác phù hợp với kết quả của O’Dwyer và cộng sự (2023). Điểm khác là các nghiên cứu quốc tế chủ yếu khảo sát trường có văn phòng chuyển giao chuyên trách, trong khi bài báo đề xuất phân công theo chức năng, cho phép trường nhỏ dùng nhân sự kiêm nhiệm và dịch vụ thuê ngoài. Điểm khác thứ hai là cơ chế lợi ích: ở Việt Nam, trường phải đồng thời áp dụng mức thưởng tối thiểu theo nguồn kinh phí và thù lao theo Luật Sở hữu trí tuệ, nên cần tách các khoản này ngay trong quy chế.</w:t>
+        <w:t>Cơ chế đề xuất buộc trường lựa chọn giữa một số phương án có đánh đổi. Thứ nhất, công bố sớm và bảo hộ: chờ nộp đơn có thể làm chậm công bố, ảnh hưởng đến tiến độ của người nghiên cứu, trong khi giá trị học thuật và xã hội của nhiều kết quả hình thành chính qua công bố, chia sẻ. Vì vậy, Khâu 4 phải cho phép quyết định công bố mà không bảo hộ, và luồng không chờ nghiệm thu nhằm rút ngắn thời gian chờ chứ không giữ mọi kết quả lại. Thời hạn sau bộc lộ chỉ là phương án dự phòng, vì không phải mọi trường hợp bộc lộ đều đáp ứng điều kiện luật định. Thứ hai, thuê ngoài và phát triển năng lực nội bộ: thuê tổ chức đại diện linh hoạt về chi phí và chuyên môn soạn đơn, nhưng không tích lũy năng lực nhận diện sớm trong trường; phương án hợp lý hơn với trường quy mô nhỏ là giữ Khâu 2 trong trường và thuê ngoài Khâu 3, Khâu 5 theo hồ sơ. Thứ ba, tăng số đơn và kiểm soát chất lượng tài sản: chỉ tiêu số đơn có thể khuyến khích nộp đơn ít giá trị khai thác, phát sinh phí duy trì. Do đó, Bảng 2 dùng tỷ lệ đơn nộp trước công bố thay cho số đơn tuyệt đối, và quy trình cần có quyết định định kỳ về việc tiếp tục hay ngừng duy trì văn bằng.</w:t>
       </w:r>
     </w:p>
     <w:p>
@@ -3029,7 +3855,7 @@
           <w:b w:val="0"/>
           <w:i w:val="0"/>
         </w:rPr>
-        <w:t>Đóng góp của bài báo nằm ở cách liên kết: Bảng 1 và Bảng 2 chuyển yêu cầu chính sách thành nội dung quản lý, chủ thể, điều kiện và chỉ số. Cách làm này giúp trường phân biệt ba loại yêu cầu: nghĩa vụ phải tuân thủ, như mức thưởng tối thiểu hay thời hạn nộp đơn; định hướng cần cụ thể hóa, như dùng chỉ số sở hữu trí tuệ trong đánh giá; và quyền có thể lựa chọn, như thành lập doanh nghiệp quản lý tài sản trí tuệ. Sự phân biệt này hạn chế rủi ro bỏ sót nghĩa vụ pháp lý hoặc đầu tư vào bộ máy khi chưa có nhu cầu, và phù hợp với tinh thần của Khuyến nghị (EU) 2022/2415 về việc công khai chính sách quản lý tài sản trí tuệ và thống nhất chỉ số đo lường (Council of the European Union, 2022).</w:t>
+        <w:t>Đối chiếu với các công trình được lựa chọn, hệ thống đề xuất kế thừa ba điểm: khai báo là đầu vào của quy trình (Siegel et al., 2007); tra cứu sáng chế và phân tích tự do hoạt động được đưa vào quy trình và đào tạo (World Intellectual Property Organization, 2020); thỏa thuận sở hữu trí tuệ được xác lập trong giai đoạn gắn kết của hợp tác (O’Dwyer et al., 2023). Điểm khác là hai nghiên cứu quốc tế được lựa chọn khảo sát trường có văn phòng chuyển giao chuyên trách, trong khi bài báo đề xuất phân công theo chức năng cho trường chưa có văn phòng. Điểm khác thứ hai là ở Việt Nam, trường phải đồng thời áp dụng mức thưởng tối thiểu theo nguồn kinh phí, thù lao theo Luật Sở hữu trí tuệ và quy định của Nghị định số 267/2025/NĐ-CP về đồng tác giả, nên các khoản này cần được tách ngay trong quy chế.</w:t>
       </w:r>
     </w:p>
     <w:p>
@@ -3043,7 +3869,7 @@
           <w:b w:val="0"/>
           <w:i w:val="0"/>
         </w:rPr>
-        <w:t>Điều kiện áp dụng khác nhau theo loại hình trường, nguồn lực và đặc điểm tài sản. Trường khối kỹ thuật, công nghệ, y dược cần tập trung vào tra cứu, bảo mật trước công bố và kinh phí nộp đơn. Trường khối kinh tế, xã hội, ngôn ngữ chủ yếu tạo ra tác phẩm, nên trọng tâm là quyền của các chủ thể, ghi nhận tác phẩm và liêm chính, như Võ (2025) đã phân tích. Trường có nhiều nhiệm vụ sử dụng ngân sách nhà nước cần chú ý quy định chuyển tiếp tại Điều 73 Luật số 93/2025/QH15, vì cùng một trường có thể đồng thời có nhiệm vụ chịu hai chế độ khác nhau. Trường có nguồn lực hạn chế có thể ưu tiên Giải pháp 1, 3 và 5, vốn chủ yếu là điều chỉnh văn bản, quy trình và đào tạo.</w:t>
+        <w:t>Đóng góp của bài báo là cách phân loại yêu cầu theo hai chiều: tính chất, gồm định hướng, nghĩa vụ, quyền và điều kiện pháp lý; và mức độ thay đổi, gồm mới, sửa đổi và kế thừa. Cách phân loại này giúp trường ưu tiên điều chỉnh ở nơi pháp luật thực sự thay đổi, phân biệt điều kiện để được bảo hộ với nghĩa vụ phải thực hiện, và tránh đầu tư bộ máy chỉ vì một quyền mới được trao, phù hợp với tinh thần công khai chính sách và thống nhất chỉ số của Khuyến nghị (EU) 2022/2415 (Council of the European Union, 2022). Điều kiện áp dụng khác nhau theo loại trường: trường khối kỹ thuật, y dược cần tập trung vào luồng nộp đơn trước công bố và kinh phí; trường khối kinh tế, xã hội chủ yếu tạo ra tác phẩm, nên trọng tâm là quyền của các chủ thể và liêm chính, như Võ (2025) đã phân tích; trường có nhiều nhiệm vụ từ ngân sách cần chú ý quy định chuyển tiếp tại Điều 73 Luật số 93/2025/QH15.</w:t>
       </w:r>
     </w:p>
     <w:p>
@@ -3057,7 +3883,7 @@
           <w:b w:val="0"/>
           <w:i w:val="0"/>
         </w:rPr>
-        <w:t>Bài báo có một số giới hạn. Nghiên cứu dựa trên tài liệu công khai, nên chưa phản ánh cách các trường đang thực hiện các văn bản mới; hệ thống giải pháp chưa được kiểm chứng qua triển khai, nên chưa thể kết luận về hiệu quả; và kết quả không đại diện cho thực trạng của mọi trường. Văn bản quy định chi tiết Điều 28 Luật số 93/2025/QH15 có thể làm thay đổi cách tính lợi ích trình bày ở đây. Nghiên cứu tiếp theo có thể tham vấn chuyên gia quản lý khoa học, pháp chế, tài chính, hoặc thí điểm quy trình tại một số đơn vị và dùng Bảng 2 để đo kết quả trước và sau khi áp dụng.</w:t>
+        <w:t>Bài báo có một số giới hạn. Tài liệu được chọn có chủ đích và số nghiên cứu ít, nên nhận xét về nghiên cứu không khái quát cho toàn bộ tài liệu quốc tế. Việc phân loại do nhóm tác giả thực hiện, chưa có mã hóa độc lập. Nghiên cứu dựa trên văn bản, chưa phản ánh cách các trường đang thực hiện; hệ thống giải pháp chưa được kiểm chứng qua triển khai. Nghị định số 267/2025/NĐ-CP đã được đối chiếu, nhưng chưa có quy định về phương pháp xác định lợi nhuận của một kết quả hình thành từ nhiều nguồn kinh phí. Nghiên cứu tiếp theo có thể nhờ người thứ hai mã hóa độc lập bảng trích xuất, tham vấn chuyên gia quản lý khoa học, pháp chế, tài chính, hoặc thí điểm quy trình tại một số đơn vị và dùng Bảng 2 để đo kết quả trước và sau khi áp dụng.</w:t>
       </w:r>
     </w:p>
     <w:p>
@@ -3086,7 +3912,7 @@
           <w:b w:val="0"/>
           <w:i w:val="0"/>
         </w:rPr>
-        <w:t>Bài báo phân tích các yêu cầu từ chính sách mới đối với quản lý sở hữu trí tuệ trong trường đại học và chuyển chúng thành hệ thống giải pháp cùng điều kiện tổ chức thực hiện.</w:t>
+        <w:t>Bài báo xác định những thay đổi trong yêu cầu chính sách đối với quản lý quyền sở hữu trí tuệ trong trường đại học và chuyển các thay đổi đó thành cơ chế thực hiện ở cấp trường.</w:t>
       </w:r>
     </w:p>
     <w:p>
@@ -3100,7 +3926,7 @@
           <w:b w:val="0"/>
           <w:i w:val="0"/>
         </w:rPr>
-        <w:t>Kết quả cho thấy các văn bản ban hành hoặc sửa đổi giai đoạn 2025 - 2026 đặt ra năm nhóm yêu cầu: gắn sở hữu trí tuệ với chiến lược và đánh giá; gắn nhận diện, bảo hộ với nghiên cứu và công bố; nâng cao năng lực hỗ trợ, khai thác; hoàn thiện cơ chế lợi ích, dữ liệu và trách nhiệm giải trình; phát triển đào tạo và văn hóa sở hữu trí tuệ. Các yêu cầu này gồm cả định hướng chính sách, nghĩa vụ pháp lý và quyền được trao, và mỗi nhóm đòi hỏi thay đổi đồng thời ở nhiều cấu phần quản lý. Phân tích này ủng hộ luận điểm định hướng rằng yêu cầu chính sách cần được cụ thể hóa đồng bộ trong quy chế, tổ chức, quy trình, nguồn lực và năng lực của trường; mức độ hiệu quả của cách làm đó còn cần được kiểm chứng.</w:t>
+        <w:t>Kết quả cho thấy thay đổi thực chất tập trung ở quyền đối với kết quả nghiên cứu, cơ chế lợi ích của tác giả và quyền tổ chức khai thác: quyền được giao tự động, mức thưởng tối thiểu theo nguồn kinh phí, yêu cầu ghi nhận đóng góp của đồng tác giả và quyền thành lập doanh nghiệp quản lý tài sản trí tuệ. Yêu cầu dùng chỉ số sở hữu trí tuệ trong đánh giá và đăng ký bảo hộ đồng thời với công bố là nội dung kế thừa, nay có thêm quyền đăng ký và căn cứ chi rõ hơn. Thời hạn sau bộc lộ là điều kiện để giữ tính mới, không thay thế nguyên tắc nộp đơn trước công bố. Từ các thay đổi này, quyết định khai thác, phân chia lợi ích, nộp đơn và chi tiền phải có chủ thể, trình tự và căn cứ trong quy chế của trường; quy trình cần cho phép quyết định và cấp kinh phí nộp đơn trước khi công bố mà không chờ nghiệm thu.</w:t>
       </w:r>
     </w:p>
     <w:p>
@@ -3114,7 +3940,7 @@
           <w:b w:val="0"/>
           <w:i w:val="0"/>
         </w:rPr>
-        <w:t>Đóng góp của bài báo là một cách liên kết từng yêu cầu chính sách với nhiệm vụ, trách nhiệm và chỉ số theo dõi ở cấp trường. Về hàm ý tổ chức thực hiện, mỗi trường nên bắt đầu bằng việc phân loại yêu cầu theo nghĩa vụ, định hướng và quyền; ưu tiên hoàn thiện quy chế, quy trình sàng lọc trước công bố và đào tạo; lựa chọn hình thức tổ chức theo quy mô hồ sơ thực tế; và đánh giá năm đầu triển khai bằng chỉ số hoạt động trước khi kỳ vọng vào chỉ số khai thác.</w:t>
+        <w:t>Đóng góp của bài báo là cách phân biệt yêu cầu theo tính chất và mức độ thay đổi, gắn mỗi thay đổi với quyết định quản lý và chỉ số có định nghĩa. Về hàm ý, mỗi trường nên bắt đầu bằng việc rà soát quy chế theo các dòng mới và sửa đổi của Bảng 1; ưu tiên luồng nộp đơn trước công bố và nguồn chi tương ứng; lựa chọn hình thức tổ chức theo quy mô hồ sơ thực tế; và đánh giá năm đầu bằng chỉ số hoạt động, có cân nhắc các đánh đổi giữa công bố và bảo hộ, thuê ngoài và năng lực nội bộ, số lượng và chất lượng đơn.</w:t>
       </w:r>
     </w:p>
     <w:p>
@@ -3153,6 +3979,37 @@
           <w:sz w:val="19"/>
         </w:rPr>
         <w:t>Kết luận số 51-KL/TW ngày 17 tháng 6 năm 2026 về đẩy mạnh công tác sở hữu trí tuệ phục vụ phát triển kinh tế - xã hội trong tình hình mới</w:t>
+      </w:r>
+      <w:r>
+        <w:rPr>
+          <w:b w:val="0"/>
+          <w:i w:val="0"/>
+          <w:sz w:val="19"/>
+        </w:rPr>
+        <w:t>.</w:t>
+      </w:r>
+    </w:p>
+    <w:p>
+      <w:pPr>
+        <w:spacing w:before="0" w:after="40"/>
+        <w:ind w:left="340" w:hanging="340"/>
+        <w:jc w:val="left"/>
+      </w:pPr>
+      <w:r>
+        <w:rPr>
+          <w:b w:val="0"/>
+          <w:i w:val="0"/>
+          <w:sz w:val="19"/>
+        </w:rPr>
+        <w:t xml:space="preserve">Chính phủ. (2025). </w:t>
+      </w:r>
+      <w:r>
+        <w:rPr>
+          <w:b w:val="0"/>
+          <w:i/>
+          <w:sz w:val="19"/>
+        </w:rPr>
+        <w:t>Nghị định số 267/2025/NĐ-CP ngày 14 tháng 10 năm 2025 quy định chi tiết và hướng dẫn một số điều của Luật Khoa học, công nghệ và đổi mới sáng tạo về chương trình, nhiệm vụ khoa học, công nghệ và đổi mới sáng tạo và một số quy định về thúc đẩy hoạt động nghiên cứu khoa học, phát triển công nghệ và đổi mới sáng tạo</w:t>
       </w:r>
       <w:r>
         <w:rPr>

</xml_diff>